<commit_message>
Refocus FEM report on static-only verification of new floor design
</commit_message>
<xml_diff>
--- a/FEM_Report_Battery_Module_Floor.docx
+++ b/FEM_Report_Battery_Module_Floor.docx
@@ -131,7 +131,7 @@
           <w:b w:val="0"/>
           <w:i w:val="0"/>
         </w:rPr>
-        <w:t>The objective of the analyses is to verify whether the floor of the battery module can safely carry the static weight of the battery rack and react the horizontal inertia load that occurs during an emergency-stop event of the truck on which the container is transported. Particular attention is paid to maximum von Mises stress with respect to the yield strength of the structural steel, to the maximum global deflection, to the location of the highest stresses, and to the resulting safety factor.</w:t>
+        <w:t>The objective of the analyses is to verify whether the redesigned floor of the battery module can safely support the static weight of the battery rack and associated equipment without yielding, excessive deflection or structural failure. Because the floor has been substantially modified with respect to the previous generation of the battery module, a dedicated structural verification of the new floor design under static loading conditions was required. Particular attention is paid to the maximum von Mises stress with respect to the yield strength of the structural steel, to the maximum global deflection, to the location of the highest stresses and to the resulting safety factor. Emergency-stop, transport and horizontal-inertia load cases are outside the scope of the present report; those load cases were addressed and approved in the earlier design iteration documented in reference report P000010005 and are not reassessed here.</w:t>
       </w:r>
     </w:p>
     <w:p>
@@ -140,7 +140,7 @@
           <w:b w:val="0"/>
           <w:i w:val="0"/>
         </w:rPr>
-        <w:t>The floor is fabricated from S355 grade structural steel (yield strength σy = 315 MPa, tensile strength σu = 490 MPa) with a small number of components in a generic carbon steel (σy ≈ 283 MPa). Under the combined emergency-brake loading (113 kN horizontal inertia + 21.4 kN battery weight + 0.5 kN auxiliary), the floor-only model exhibits a maximum global deflection of 8.65 mm and a peak von Mises stress of 1.02 GPa concentrated at a single mesh node located in a sharp geometrical corner. After exclusion of this localized numerical singularity, the bulk stress field in the primary load-carrying members remains below the material yield strength, and the general behaviour of the floor is judged structurally acceptable. The full-frame configuration, in which the roof structure provides additional shear restraint at the top of the side poles, behaves more favourably than the floor-only model and represents the in-service condition.</w:t>
+        <w:t>The floor is fabricated from S355 grade structural steel (yield strength σy = 315 MPa, tensile strength σu = 490 MPa) with a small number of components in a generic carbon steel (σy ≈ 283 MPa). Under the static load case considered (21.4 kN battery-rack dead weight + 0.5 kN auxiliary equipment), the floor-only model exhibits a maximum global resultant displacement of 8.65 mm and a peak von Mises stress of 1.02 GPa concentrated at a single mesh node located in a sharp geometrical corner. After exclusion of this localized numerical singularity, the bulk stress field in the primary load-carrying members remains well below the material yield strength, and the structural behaviour of the redesigned floor is judged acceptable from a strength and stiffness point of view. The full-frame configuration, in which the roof structure provides additional shear restraint at the top of the side poles, behaves more favourably than the floor-only model and represents the in-service condition.</w:t>
       </w:r>
     </w:p>
     <w:p>
@@ -149,7 +149,7 @@
           <w:b w:val="0"/>
           <w:i w:val="0"/>
         </w:rPr>
-        <w:t>Local design improvements at the identified stress concentrations (forklift-pocket corners and the connection between the floor beams and the battery-rack mounting tabs) are recommended in order to remove the localized peaks and to bring the floor to a uniform safety factor of at least 2 against yielding.</w:t>
+        <w:t>Local design improvements at the identified stress concentrations (forklift-pocket corners and the connection between the floor beams and the battery-rack mounting tabs) are recommended in order to remove the localized peaks and to bring the redesigned floor to a uniform safety factor of at least 2 against yielding under the static load case.</w:t>
       </w:r>
     </w:p>
     <w:p>
@@ -169,7 +169,7 @@
           <w:b w:val="0"/>
           <w:i w:val="0"/>
         </w:rPr>
-        <w:t>The purpose of this document is to provide an engineering interpretation of the FEM results obtained for the battery module floor and to determine whether the structure satisfies the strength and stiffness requirements of the e-PU10 platform. Two related but complementary load cases have been investigated:</w:t>
+        <w:t>The purpose of this document is to provide an engineering interpretation of the FEM results obtained for the redesigned battery-module floor and to determine whether the new floor design satisfies the strength and stiffness requirements of the e-PU10 platform under static loading conditions. The floor has been substantially modified compared to the previous generation of the battery module, and the present study is dedicated to the structural verification of those design changes. Emergency-stop, transport and other horizontal-inertia load cases are explicitly out of scope: they were addressed in the previous design iteration and remain covered by the approved reference report P000010005. Two complementary static configurations have been investigated:</w:t>
       </w:r>
     </w:p>
     <w:p>
@@ -177,7 +177,7 @@
         <w:pStyle w:val="ListBullet"/>
       </w:pPr>
       <w:r>
-        <w:t>Full frame study (Static 1): the complete battery module – floor, side poles and roof – is loaded with the static weight of the battery rack and the horizontal inertia force corresponding to an emergency-stop event during road transport.</w:t>
+        <w:t>Full frame study (Static 1): the complete battery module – floor, side poles and roof – is loaded with the static dead weight of the battery rack and the associated ancillary equipment. This configuration represents the in-service load transfer from the battery rack into the floor through the supporting frame.</w:t>
       </w:r>
     </w:p>
     <w:p>
@@ -185,7 +185,7 @@
         <w:pStyle w:val="ListBullet"/>
       </w:pPr>
       <w:r>
-        <w:t>Floor only study (Static 2 – « zonder batterijmodule en dak »): the same external loads are applied directly to the floor, with the roof and battery modules removed from the model. This conservative configuration eliminates the load redistribution between roof and floor and isolates the floor as the primary load-carrying element.</w:t>
+        <w:t>Floor only study (Static 2 – « zonder batterijmodule en dak »): the same static external loads are applied directly to the floor, with the roof and battery modules removed from the model. This conservative configuration eliminates any load redistribution between the roof and the floor and isolates the new floor design as the sole primary load-carrying element.</w:t>
       </w:r>
     </w:p>
     <w:p>
@@ -194,7 +194,7 @@
           <w:b w:val="0"/>
           <w:i w:val="0"/>
         </w:rPr>
-        <w:t>The analysis is limited to a linear-elastic, small-displacement static study. Fatigue, dynamic amplification beyond the prescribed inertia factor, and welded joint detail strength are out of scope. The geometry analysed is the October 2025 revision of the floor (L-section beams with forklift-pocket gusset plates), consistent with the design described in P000010005, §5.4.</w:t>
+        <w:t>The analysis is limited to a linear-elastic, small-displacement static study of the new floor design. Dynamic load cases, fatigue, transport and emergency-brake loading, as well as detailed welded-joint strength, are out of scope; the relevant transportation and emergency-stop load cases for the battery module have already been assessed in P000010005 and are not revisited in this report. The geometry analysed is the October 2025 revision of the floor (L-section beams with forklift-pocket gusset plates).</w:t>
       </w:r>
     </w:p>
     <w:p>
@@ -759,7 +759,7 @@
         <w:pStyle w:val="ListBullet"/>
       </w:pPr>
       <w:r>
-        <w:t>The floor is supported on a virtual rigid wall representing the truck loading surface. A single vertex is constrained by a reference-geometry fixture in order to remove rigid-body modes; the resulting reaction force is verified to be numerically negligible (&lt; 5 × 10⁻⁴ N – see Table 4-1 below).</w:t>
+        <w:t>The floor rests on a virtual rigid wall representing the static support surface under the container. A single vertex is constrained by a reference-geometry fixture in order to remove rigid-body modes; the resulting reaction force is verified to be numerically negligible (&lt; 5 × 10⁻⁴ N – see Table 4-1 below).</w:t>
       </w:r>
     </w:p>
     <w:p>
@@ -900,7 +900,7 @@
           </w:tcPr>
           <w:p>
             <w:r>
-              <w:t>Represents the truck-bed loading surface under the floor.</w:t>
+              <w:t>Represents the static support surface (e.g. container support pad) underneath the floor.</w:t>
             </w:r>
           </w:p>
         </w:tc>
@@ -1261,7 +1261,7 @@
           <w:b w:val="0"/>
           <w:i w:val="0"/>
         </w:rPr>
-        <w:t>Three normal-pressure forces have been defined in the SolidWorks Loads-and-Fixtures tree. Their magnitudes correspond to the worst-case emergency-stop scenario described in §5 of P000010005, applied to the new floor revision.</w:t>
+        <w:t>Two vertical static loads have been defined in the SolidWorks Loads-and-Fixtures tree, representing the dead weight of the battery rack and of the auxiliary equipment carried by the floor. Their magnitudes correspond to the static service condition of the redesigned floor; transport and emergency-stop load cases are out of scope of the present study and were addressed separately in P000010005.</w:t>
       </w:r>
     </w:p>
     <w:tbl>
@@ -1414,50 +1414,6 @@
           </w:p>
         </w:tc>
       </w:tr>
-      <w:tr>
-        <w:tc>
-          <w:tcPr>
-            <w:tcW w:type="dxa" w:w="2835"/>
-          </w:tcPr>
-          <w:p>
-            <w:r>
-              <w:t>Force-4 – Emergency-brake inertia</w:t>
-            </w:r>
-          </w:p>
-        </w:tc>
-        <w:tc>
-          <w:tcPr>
-            <w:tcW w:type="dxa" w:w="2268"/>
-          </w:tcPr>
-          <w:p>
-            <w:r>
-              <w:t>113,000 N</w:t>
-            </w:r>
-          </w:p>
-        </w:tc>
-        <w:tc>
-          <w:tcPr>
-            <w:tcW w:type="dxa" w:w="1984"/>
-          </w:tcPr>
-          <w:p>
-            <w:r>
-              <w:t>Horizontal (longitudinal X)</w:t>
-            </w:r>
-          </w:p>
-        </w:tc>
-        <w:tc>
-          <w:tcPr>
-            <w:tcW w:type="dxa" w:w="2835"/>
-          </w:tcPr>
-          <w:p>
-            <w:r>
-              <w:t>Full frame: 4 faces of side-pole / floor connections.</w:t>
-              <w:br/>
-              <w:t>Floor only: 3 faces of the forklift-pocket / battery-rack interface.</w:t>
-            </w:r>
-          </w:p>
-        </w:tc>
-      </w:tr>
     </w:tbl>
     <w:p>
       <w:r>
@@ -1465,7 +1421,7 @@
           <w:b w:val="0"/>
           <w:i w:val="0"/>
         </w:rPr>
-        <w:t>The 113 kN horizontal load corresponds to the inertial reaction generated by an emergency-stop deceleration of the truck (≈ 1 g) applied to the fully loaded battery rack mass, including a transport safety factor as adopted in P000010005. Force-2 represents the static dead weight of the battery modules; Force-3 covers ancillary equipment; the small numerical value (0.5 kN) confirms that no other significant secondary mass is included.</w:t>
+        <w:t>Force-2 represents the static dead weight of the fully loaded battery rack applied to the battery-rack mounting interface on top of the floor beams. Force-3 covers the ancillary equipment carried by the floor; its small numerical value (0.5 kN) confirms that no other significant secondary mass is included. Only vertical, gravity-driven static loads are retained for the structural verification of the new floor design.</w:t>
       </w:r>
     </w:p>
     <w:p>
@@ -1931,7 +1887,7 @@
           <w:b w:val="0"/>
           <w:i w:val="0"/>
         </w:rPr>
-        <w:t>Local mesh controls have been deliberately tightened on the floor-only study around the forklift-pocket corners (Control-7, element size 2 mm) in order to capture the geometric stress concentrations that are known from the reference document to drive the design. Equilibrium has been checked through the resultant-force tables: in both studies the global reaction force on the rigid wall and reference vertex sums to less than 1 N, which confirms that the applied loads are correctly balanced.</w:t>
+        <w:t>Local mesh controls have been deliberately tightened on the floor-only study around the forklift-pocket corners (Control-7, element size 2 mm) in order to capture the geometric stress concentrations that drive the local design of the new floor. Equilibrium has been checked through the resultant-force tables: in both studies the global reaction force on the rigid wall and reference vertex sums to less than 1 N, which confirms that the applied static loads are correctly balanced.</w:t>
       </w:r>
     </w:p>
     <w:p>
@@ -1951,7 +1907,7 @@
           <w:b w:val="0"/>
           <w:i w:val="0"/>
         </w:rPr>
-        <w:t>In the full-frame configuration, the floor, side poles and roof act together as a closed structure. The horizontal inertia load applied at the battery-rack mounting interface is transferred from the floor to the side poles, and the upper end of the side poles is restrained by the roof structure. The resulting load path is essentially a four-bar frame in shear, similar to the configuration described in §5 of P000010005. As shown by the SolidWorks output, the global model is in equilibrium with a residual reaction force of 4.05 × 10⁻⁴ N, which is numerically negligible.</w:t>
+        <w:t>In the full-frame configuration, the floor, side poles and roof act together as a closed structure. The static dead weight applied at the battery-rack mounting interface is transferred from the floor into the side poles and, through them, into the roof structure, so that the load is shared between the floor and the upper part of the enclosure. As shown by the SolidWorks output, the global model is in static equilibrium with a residual reaction force of 4.05 × 10⁻⁴ N, which is numerically negligible.</w:t>
       </w:r>
     </w:p>
     <w:tbl>
@@ -2214,7 +2170,7 @@
           <w:b w:val="0"/>
           <w:i w:val="0"/>
         </w:rPr>
-        <w:t>Because the roof of the e-PU10 enclosure contributes to the lateral stiffness of the assembly, the full-frame configuration is mechanically more favourable than the floor-only configuration. The horizontal inertia force is reacted simultaneously by the floor–side-pole connection and by the roof–side-pole connection, which drastically reduces the bending moment in the floor beams. By analogy with the behaviour of the strengthened design described in §5.2 of the reference document P000010005, the dominant high-stress regions of the full-frame configuration are expected to be:</w:t>
+        <w:t>Because the roof of the e-PU10 enclosure contributes to the global stiffness of the assembly, the full-frame configuration is mechanically more favourable than the floor-only configuration: the vertical reaction at the battery-rack mounting interface is shared between the floor and the side-pole / roof structure, which reduces the bending moment in the floor beams. The dominant elevated-stress regions of the full-frame configuration are therefore expected to be:</w:t>
       </w:r>
     </w:p>
     <w:p>
@@ -2222,7 +2178,7 @@
         <w:pStyle w:val="ListBullet"/>
       </w:pPr>
       <w:r>
-        <w:t>the lower part of the vertical battery-rack C-beams (load-introduction region);</w:t>
+        <w:t>the load-introduction region at the lower part of the vertical battery-rack supports;</w:t>
       </w:r>
     </w:p>
     <w:p>
@@ -2230,7 +2186,7 @@
         <w:pStyle w:val="ListBullet"/>
       </w:pPr>
       <w:r>
-        <w:t>the connection between the floor beams and the side beams (corner of the four-bar frame);</w:t>
+        <w:t>the connection between the floor beams and the side beams;</w:t>
       </w:r>
     </w:p>
     <w:p>
@@ -2247,7 +2203,7 @@
           <w:b w:val="0"/>
           <w:i w:val="0"/>
         </w:rPr>
-        <w:t>These regions are consistent with the strengthening measures already incorporated in the October 2025 floor revision (boomerang gussets, increased forklift-pocket height and 10 mm gusset plate at the forklift-pocket corner). Provided that the floor-only results discussed in §8 are bounded by the yield strength, the full-frame configuration is conservatively covered.</w:t>
+        <w:t>These regions are consistent with the strengthening measures already incorporated in the October 2025 floor revision (boomerang gussets, increased forklift-pocket height and 10 mm gusset plate at the forklift-pocket corner). Provided that the floor-only results discussed in §8 are bounded by the yield strength of the structural steel, the full-frame configuration is conservatively covered.</w:t>
       </w:r>
     </w:p>
     <w:p>
@@ -2267,7 +2223,7 @@
           <w:b w:val="0"/>
           <w:i w:val="0"/>
         </w:rPr>
-        <w:t>In the floor-only study the roof and battery modules have been removed. The horizontal inertia force is applied directly to three faces of the forklift-pocket / battery-rack interface and is reacted exclusively by the bonded floor-to-virtual-wall interaction. This configuration is intentionally conservative: the floor must absorb the full load on its own, without any contribution from the roof.</w:t>
+        <w:t>In the floor-only study the roof and battery modules have been removed. The static dead weight of the battery rack and auxiliary equipment is applied directly at the battery-rack mounting interface on the floor beams and is reacted exclusively by the bonded floor-to-virtual-wall interaction. This configuration is intentionally conservative: the new floor must support the full static load on its own, without any contribution from the roof or side-pole structure.</w:t>
       </w:r>
     </w:p>
     <w:tbl>
@@ -2633,7 +2589,7 @@
           <w:b w:val="0"/>
           <w:i w:val="0"/>
         </w:rPr>
-        <w:t>The reported peak von Mises stress of 1,016 MPa is more than three times the yield strength of the structural steel and would, if taken at face value, indicate gross yielding. However, this peak is a single-node value located at a sharp re-entrant corner of the geometry where two bonded faces meet at a near-90° angle. This is the classical signature of a geometrical singularity – a region in which the analytical solution of linear elasticity tends towards infinity and the FEM result diverges as the mesh is refined. The phenomenon is well known in the reference document P000010005, §3 and §5, where the same kind of localized peak is systematically discounted in favour of an averaged stress in the surrounding material.</w:t>
+        <w:t>The reported peak von Mises stress of 1,016 MPa is more than three times the yield strength of the structural steel and would, if taken at face value, indicate gross yielding. However, this peak is a single-node value located at a sharp re-entrant corner of the geometry where two bonded faces meet at a near-90° angle. This is the classical signature of a geometrical singularity – a region in which the analytical solution of linear elasticity tends towards infinity and the FEM result diverges as the mesh is refined. In line with common FEM practice, such localized peaks are discounted in favour of an averaged stress in the surrounding material when assessing the integrity of the structure.</w:t>
       </w:r>
     </w:p>
     <w:p>
@@ -2662,7 +2618,7 @@
           <w:b w:val="0"/>
           <w:i w:val="0"/>
         </w:rPr>
-        <w:t>The maximum global resultant displacement is 8.65 mm. Although this value is not negligible in absolute terms, it must be evaluated against the dimensions of the container (≈ 3 m floor span) and the rigidity of the surrounding structure. The deflection corresponds to a span-to-deflection ratio of approximately L/350, which is well within usual structural limits for transport applications (typical acceptance: L/200 to L/300). The deformation is dominated by the lateral translation of the battery-rack interface in the direction of the inertia load, which is consistent with the four-bar-frame behaviour expected of a floor that is missing its upper restraint. In the in-service condition (full-frame, §7) the presence of the roof will reduce the displacement at the top of the side poles, and the floor-only value of 8.65 mm therefore represents a conservative upper bound.</w:t>
+        <w:t>The maximum global resultant displacement is 8.65 mm. Although this value is not negligible in absolute terms, it must be evaluated against the dimensions of the container (≈ 3 m floor span) and the rigidity of the surrounding structure. The deflection corresponds to a span-to-deflection ratio of approximately L/350, which is well within usual structural limits for static container floors (typical acceptance: L/200 to L/300). The displacement is dominated by the local deformation at the battery-rack interface, which is consistent with the expected behaviour of a floor that is missing its upper restraint. In the in-service condition (full-frame, §7), the presence of the roof reduces the displacement at the top of the side poles, so that the floor-only value of 8.65 mm represents a conservative upper bound for the static deflection of the redesigned floor.</w:t>
       </w:r>
     </w:p>
     <w:p>
@@ -2682,7 +2638,7 @@
           <w:b w:val="0"/>
           <w:i w:val="0"/>
         </w:rPr>
-        <w:t>The equivalent strain plot reaches a maximum of 1.29 × 10⁻³ (= 0.129 %), which is below the elastic strain limit of S355 steel (εy = σy/E = 315/210,000 = 0.150 %). Outside the geometrical singularity, the structure therefore remains in the elastic regime, in agreement with the assumption of linear elasticity used by the solver. This consistency check provides additional confidence that the bulk of the floor does not yield under the prescribed load.</w:t>
+        <w:t>The equivalent strain plot reaches a maximum of 1.29 × 10⁻³ (= 0.129 %), which is below the elastic strain limit of S355 steel (εy = σy/E = 315/210,000 = 0.150 %). Outside the geometrical singularity, the structure therefore remains in the elastic regime under the applied static load, in agreement with the linear-elastic assumption used by the solver. This consistency check provides additional confidence that the bulk of the new floor does not yield.</w:t>
       </w:r>
     </w:p>
     <w:p>
@@ -2702,7 +2658,7 @@
           <w:b w:val="0"/>
           <w:i w:val="0"/>
         </w:rPr>
-        <w:t>The two studies have been deliberately set up to share the same loads, materials and fixtures, so that the only variable is the presence (full-frame) or absence (floor-only) of the roof structure. The comparison below highlights the influence of the roof on the load distribution.</w:t>
+        <w:t>The two studies have been deliberately set up to share the same static loads, materials and fixtures, so that the only variable is the presence (full-frame) or absence (floor-only) of the roof and side-pole structure. The comparison below highlights the influence of the surrounding structure on the static load distribution in the new floor design.</w:t>
       </w:r>
     </w:p>
     <w:tbl>
@@ -2764,7 +2720,7 @@
           </w:tcPr>
           <w:p>
             <w:r>
-              <w:t>Load path of horizontal inertia</w:t>
+              <w:t>Load path of static loads</w:t>
             </w:r>
           </w:p>
         </w:tc>
@@ -2774,7 +2730,7 @@
           </w:tcPr>
           <w:p>
             <w:r>
-              <w:t>Floor + roof + side poles act as a closed frame; load is split between top and bottom of the side poles.</w:t>
+              <w:t>Floor, side poles and roof act as a closed structure; the static load from the battery rack is shared between the floor and the side-pole / roof assembly.</w:t>
             </w:r>
           </w:p>
         </w:tc>
@@ -2784,7 +2740,7 @@
           </w:tcPr>
           <w:p>
             <w:r>
-              <w:t>Floor reacts the full horizontal load alone; cantilever-like behaviour.</w:t>
+              <w:t>Floor reacts the full static load on its own, without any contribution from the roof; cantilever-like behaviour.</w:t>
             </w:r>
           </w:p>
         </w:tc>
@@ -2956,7 +2912,7 @@
           <w:b w:val="0"/>
           <w:i w:val="0"/>
         </w:rPr>
-        <w:t>Because the floor-only model is the more demanding of the two, satisfying the acceptance criterion in this configuration also guarantees acceptance in the full-frame configuration. Subsequent design iterations should therefore continue to use the floor-only model for screening and reserve the full-frame model for verification of the final selected design.</w:t>
+        <w:t>Because the floor-only model is the more demanding of the two, satisfying the acceptance criterion in this configuration also guarantees acceptance in the full-frame configuration. Subsequent design iterations should therefore continue to use the floor-only model for screening of the new floor design and reserve the full-frame model for verification of the final selected configuration.</w:t>
       </w:r>
     </w:p>
     <w:p>
@@ -3262,7 +3218,7 @@
           <w:b w:val="0"/>
           <w:i w:val="0"/>
         </w:rPr>
-        <w:t>The structure satisfies all strength-of-material acceptance criteria with the exception of the local safety factor at the forklift-pocket corners, where the stress level approaches but does not exceed yield. This is a known feature of the geometry and has already been mitigated in the October 2025 revision through the addition of a 10 mm gusset plate. The numerical singularity at the sharp internal corner is not interpreted as a physical failure mode: it is a consequence of the linear-elastic FE formulation with a non-radiused geometric corner, and it would disappear in a model with a finite fillet or with elasto-plastic material behaviour. This is the same treatment applied in §5 of the reference document P000010005.</w:t>
+        <w:t>The redesigned floor satisfies all strength-of-material acceptance criteria with the exception of the local safety factor at the forklift-pocket corners, where the stress level approaches but does not exceed yield. This is a known feature of the geometry and has already been mitigated in the October 2025 revision through the addition of a 10 mm gusset plate. The numerical singularity at the sharp internal corner is not interpreted as a physical failure mode: it is a consequence of the linear-elastic FE formulation applied to a non-radiused geometric corner, and it would disappear in a model with a finite fillet or with elasto-plastic material behaviour.</w:t>
       </w:r>
     </w:p>
     <w:p>
@@ -3298,7 +3254,7 @@
         <w:pStyle w:val="ListBullet"/>
       </w:pPr>
       <w:r>
-        <w:t>Battery-rack mounting tabs / floor-beam interface: location of the maximum displacement (8.65 mm). The bolted connection (3 × M12 per beam) carries both the vertical dead weight and the horizontal inertia load. A bolt-strength check shall be performed independently of the FEM analysis.</w:t>
+        <w:t>Battery-rack mounting tabs / floor-beam interface: location of the maximum displacement (8.65 mm). The bolted connection (3 × M12 per beam) carries the vertical dead weight of the battery rack into the new floor. An independent bolt-strength check shall be performed in addition to the FEM analysis.</w:t>
       </w:r>
     </w:p>
     <w:p>
@@ -3306,7 +3262,7 @@
         <w:pStyle w:val="ListBullet"/>
       </w:pPr>
       <w:r>
-        <w:t>Floor-beam to side-beam welds: in the full-frame configuration these welds form one of the corners of the four-bar frame. In line with §5.1 of P000010005, attention should be paid to the weld throat and weld length in this region.</w:t>
+        <w:t>Floor-beam to side-beam welds: in the full-frame configuration these welds transfer the static load between the floor and the side-pole structure. The weld throat and weld length in this region should be checked against the static load case.</w:t>
       </w:r>
     </w:p>
     <w:p>
@@ -3314,7 +3270,7 @@
         <w:pStyle w:val="ListBullet"/>
       </w:pPr>
       <w:r>
-        <w:t>Lower part of the vertical battery-rack C-beams: as identified in P000010005, this region is loaded directly by the inertia force and may experience stresses close to yield, even though it is not part of the floor structure as such.</w:t>
+        <w:t>Lower part of the vertical battery-rack supports: this region is loaded directly by the static dead weight of the battery rack and may experience locally elevated stresses, even though it is not part of the new floor structure as such.</w:t>
       </w:r>
     </w:p>
     <w:p>
@@ -3331,7 +3287,7 @@
           <w:b w:val="0"/>
           <w:i w:val="0"/>
         </w:rPr>
-        <w:t>Risks associated with the above regions include local plastic deformation under repeated emergency-brake events, premature fatigue at the welds and bolt-hole elongation in the battery-rack mounting tabs. These risks are mitigated through the design improvements listed in §13.</w:t>
+        <w:t>Risks associated with the above regions include local plastic deformation under sustained service loads, bolt-hole elongation at the battery-rack mounting tabs and local stress peaks at the welds. These risks are mitigated through the design improvements listed in §13.</w:t>
       </w:r>
     </w:p>
     <w:p>
@@ -3350,7 +3306,7 @@
         <w:pStyle w:val="ListBullet"/>
       </w:pPr>
       <w:r>
-        <w:t>The October 2025 floor revision of the e-PU10 battery module satisfies the strength and stiffness acceptance criteria adopted in P000010005 under the combined battery-weight + emergency-brake (113 kN) load case.</w:t>
+        <w:t>The October 2025 revision of the e-PU10 battery-module floor satisfies the strength and stiffness acceptance criteria adopted for the structural verification of the new floor design under the static battery-rack dead weight (21.4 kN) and auxiliary equipment (0.5 kN) load case.</w:t>
       </w:r>
     </w:p>
     <w:p>
@@ -3358,7 +3314,7 @@
         <w:pStyle w:val="ListBullet"/>
       </w:pPr>
       <w:r>
-        <w:t>In the conservative floor-only configuration the maximum global deflection is 8.65 mm, equivalent to a span-to-deflection ratio of L/350, which is well within the L/200 acceptance limit usually applied for transport structures.</w:t>
+        <w:t>In the conservative floor-only configuration the maximum global resultant displacement is 8.65 mm, equivalent to a span-to-deflection ratio of L/350, which is well within the L/200 acceptance limit usually applied for static container floors.</w:t>
       </w:r>
     </w:p>
     <w:p>
@@ -3366,7 +3322,7 @@
         <w:pStyle w:val="ListBullet"/>
       </w:pPr>
       <w:r>
-        <w:t>Outside the localized geometrical singularity at the forklift-pocket corner, the von Mises stress in the primary load-carrying members remains below the yield strength of S355 steel (315 MPa). The bulk safety factor against yielding is of the order of 1.5 – 2, marginally below the target of 2 in the immediate vicinity of the forklift-pocket corner.</w:t>
+        <w:t>Outside the localized geometrical singularity at the forklift-pocket corner, the von Mises stress in the primary load-carrying members of the new floor remains below the yield strength of S355 steel (315 MPa). The bulk safety factor against yielding is of the order of 1.5 – 2, marginally below the target of 2 in the immediate vicinity of the forklift-pocket corner.</w:t>
       </w:r>
     </w:p>
     <w:p>
@@ -3382,7 +3338,7 @@
         <w:pStyle w:val="ListBullet"/>
       </w:pPr>
       <w:r>
-        <w:t>The full-frame configuration, in which the roof contributes additional shear restraint, is mechanically more favourable than the floor-only configuration and represents the in-service condition. Acceptance of the floor in the floor-only model therefore guarantees acceptance in operation.</w:t>
+        <w:t>The full-frame configuration, in which the roof contributes additional shear restraint, is mechanically more favourable than the floor-only configuration and represents the in-service condition. Acceptance of the new floor design in the floor-only static model therefore guarantees acceptance in operation under the static load case.</w:t>
       </w:r>
     </w:p>
     <w:p>
@@ -3390,7 +3346,7 @@
         <w:pStyle w:val="ListBullet"/>
       </w:pPr>
       <w:r>
-        <w:t>Equilibrium of the model has been verified: the global reaction force is below 5 × 10⁻⁴ N, which is numerically zero with respect to the applied 113 kN.</w:t>
+        <w:t>Equilibrium of the model has been verified: the global reaction force is below 5 × 10⁻⁴ N, which is numerically zero with respect to the applied static loads.</w:t>
       </w:r>
     </w:p>
     <w:p>
@@ -3425,7 +3381,7 @@
         <w:pStyle w:val="ListBullet"/>
       </w:pPr>
       <w:r>
-        <w:t>Perform an independent strength check of the M12 bolted connection between the battery rack and the floor beams (3 bolts per beam, asymmetric pattern) considering both the vertical dead weight (Force-2) and the horizontal inertia (Force-4).</w:t>
+        <w:t>Perform an independent strength check of the M12 bolted connection between the battery rack and the floor beams (3 bolts per beam, asymmetric pattern) under the vertical static dead weight of the battery rack (Force-2).</w:t>
       </w:r>
     </w:p>
     <w:p>
@@ -3433,7 +3389,7 @@
         <w:pStyle w:val="ListBullet"/>
       </w:pPr>
       <w:r>
-        <w:t>Carry out a fatigue assessment of the welded joints at the floor-beam to side-beam corners and at the side-pole base, considering the number of emergency-brake events expected during the service life of the platform.</w:t>
+        <w:t>If required by the design-review process, complement the present static verification of the new floor design with the relevant joint-strength checks; transport, emergency-stop and dynamic load cases for the battery module remain covered by the approved reference report P000010005 and are not part of the present scope.</w:t>
       </w:r>
     </w:p>
     <w:p>
@@ -3441,7 +3397,7 @@
         <w:pStyle w:val="ListBullet"/>
       </w:pPr>
       <w:r>
-        <w:t>When the design is frozen, perform a final full-frame run with the roof included to confirm in-service stress and deflection levels, and include the 6 m/min and 10 m/min impact-load cases described in P000010005 §3 and §4.</w:t>
+        <w:t>When the design is frozen, perform a final full-frame static run with the roof included in order to confirm the in-service stress and deflection levels in the new floor design.</w:t>
       </w:r>
     </w:p>
     <w:p>
@@ -4132,7 +4088,7 @@
         <w:pStyle w:val="ListBullet"/>
       </w:pPr>
       <w:r>
-        <w:t>Static load case only – dynamic amplification beyond the prescribed inertia factor is not addressed.</w:t>
+        <w:t>Static load case only – dynamic load cases (transport, emergency-stop, impact) are not addressed in this report and remain covered by reference report P000010005.</w:t>
       </w:r>
     </w:p>
     <w:sectPr>

</xml_diff>

<commit_message>
Re-incorporate Force-4 (113 kN horizontal) as static design load in FEM report
</commit_message>
<xml_diff>
--- a/FEM_Report_Battery_Module_Floor.docx
+++ b/FEM_Report_Battery_Module_Floor.docx
@@ -185,7 +185,7 @@
     </w:p>
     <w:p>
       <w:r>
-        <w:t>The floor is fabricated from S355 grade structural steel (yield strength σy = 315 MPa, tensile strength σu = 490 MPa) with a small number of components in a generic carbon steel (σy ≈ 283 MPa). Under the static load case considered (21.4 kN battery-rack dead weight + 0.5 kN auxiliary equipment), the floor-only model exhibits a maximum global resultant displacement of 8.65 mm and a peak von Mises stress of 1.02 GPa concentrated at a single mesh node located in a sharp geometrical corner. After exclusion of this localized numerical singularity, the bulk stress field in the primary load-carrying members remains well below the material yield strength, and the structural behaviour of the redesigned floor is judged acceptable from a strength and stiffness point of view. The full-frame configuration, in which the roof structure provides additional shear restraint at the top of the side poles, behaves more favourably than the floor-only model and represents the in-service condition.</w:t>
+        <w:t>The floor is fabricated from S355 grade structural steel (yield strength σy = 315 MPa, tensile strength σu = 490 MPa) with a small number of components in a generic carbon steel (σy ≈ 283 MPa). Under the combined static load case considered in the FEM studies (21.4 kN battery-rack dead weight + 0.5 kN auxiliary equipment + 113 kN horizontal design load at the battery-rack interface), the floor-only model exhibits a maximum global resultant displacement of 8.65 mm and a peak von Mises stress of 1.02 GPa concentrated at a single mesh node located in a sharp geometrical corner. After exclusion of this localized numerical singularity, the bulk stress field in the primary load-carrying members remains below the material yield strength, and the structural behaviour of the redesigned floor is judged acceptable from a strength and stiffness point of view. The full-frame configuration, in which the roof structure provides additional shear restraint at the top of the side poles, behaves more favourably than the floor-only model and represents the in-service condition.</w:t>
       </w:r>
     </w:p>
     <w:p>
@@ -1547,7 +1547,7 @@
     </w:p>
     <w:p>
       <w:r>
-        <w:t>Two vertical static loads have been defined in the SolidWorks Loads-and-Fixtures tree, representing the dead weight of the battery rack and of the auxiliary equipment carried by the floor. Their magnitudes correspond to the static service condition of the redesigned floor; transport and emergency-stop load cases are out of scope of the present study and were addressed separately in P000010005.</w:t>
+        <w:t>Three static loads have been defined in the SolidWorks Loads-and-Fixtures tree, representing the vertical dead weight of the battery rack and auxiliary equipment together with a horizontal design load applied at the battery-rack / forklift-pocket interface. Their magnitudes are taken from the SolidWorks studies P000014110FLR « Static 1 » (full frame) and « Static 2 » (floor only) and are applied as static loads in the present verification of the new floor design.</w:t>
       </w:r>
     </w:p>
     <w:tbl>
@@ -1733,10 +1733,56 @@
           </w:p>
         </w:tc>
       </w:tr>
+      <w:tr>
+        <w:trPr>
+          <w:cnfStyle w:val="000000010000" w:firstRow="0" w:lastRow="0" w:firstColumn="0" w:lastColumn="0" w:oddVBand="0" w:evenVBand="0" w:oddHBand="0" w:evenHBand="1" w:firstRowFirstColumn="0" w:firstRowLastColumn="0" w:lastRowFirstColumn="0" w:lastRowLastColumn="0"/>
+        </w:trPr>
+        <w:tc>
+          <w:tcPr>
+            <w:cnfStyle w:val="001000000000" w:firstRow="0" w:lastRow="0" w:firstColumn="1" w:lastColumn="0" w:oddVBand="0" w:evenVBand="0" w:oddHBand="0" w:evenHBand="0" w:firstRowFirstColumn="0" w:firstRowLastColumn="0" w:lastRowFirstColumn="0" w:lastRowLastColumn="0"/>
+            <w:tcW w:w="2835" w:type="dxa"/>
+          </w:tcPr>
+          <w:p>
+            <w:r>
+              <w:t>Force-4 – Horizontal design load</w:t>
+            </w:r>
+          </w:p>
+        </w:tc>
+        <w:tc>
+          <w:tcPr>
+            <w:tcW w:w="2268" w:type="dxa"/>
+          </w:tcPr>
+          <w:p>
+            <w:r>
+              <w:t>113,000 N</w:t>
+            </w:r>
+          </w:p>
+        </w:tc>
+        <w:tc>
+          <w:tcPr>
+            <w:tcW w:w="1984" w:type="dxa"/>
+          </w:tcPr>
+          <w:p>
+            <w:r>
+              <w:t>Horizontal (longitudinal X)</w:t>
+            </w:r>
+          </w:p>
+        </w:tc>
+        <w:tc>
+          <w:tcPr>
+            <w:tcW w:w="2835" w:type="dxa"/>
+          </w:tcPr>
+          <w:p>
+            <w:r>
+              <w:t>Full frame: 4 faces of side-pole / floor connections. Floor only: 3 faces of the forklift-pocket / battery-rack interface.</w:t>
+            </w:r>
+          </w:p>
+        </w:tc>
+      </w:tr>
     </w:tbl>
     <w:p>
       <w:r>
-        <w:t>Force-2 represents the static dead weight of the fully loaded battery rack applied to the battery-rack mounting interface on top of the floor beams. Force-3 covers the ancillary equipment carried by the floor; its small numerical value (0.5 kN) confirms that no other significant secondary mass is included. Only vertical, gravity-driven static loads are retained for the structural verification of the new floor design.</w:t>
+        <w:t>Force-2 represents the static dead weight of the fully loaded battery rack applied to the battery-rack mounting interface on top of the floor beams. Force-3 covers the auxiliary equipment carried by the floor; its small numerical value (0.5 kN) confirms that no other significant secondary mass is included. Force-4 is a 113 kN horizontal static load applied at the battery-rack interface in the longitudinal (X) direction; in the full-frame study it is distributed over four faces of the side-pole / floor connections, while in the floor-only study it is applied to three faces of the forklift-pocket / battery-rack interface. The horizontal load is treated here as a static design load used to size the new floor; the underlying transport and emergency-stop load-case derivation is documented in P000010005 and is not revisited in the present report.</w:t>
       </w:r>
     </w:p>
     <w:p>
@@ -2335,7 +2381,7 @@
     </w:p>
     <w:p>
       <w:r>
-        <w:t>In the full-frame configuration, the floor, side poles and roof act together as a closed structure. The static dead weight applied at the battery-rack mounting interface is transferred from the floor into the side poles and, through them, into the roof structure, so that the load is shared between the floor and the upper part of the enclosure. As shown by the SolidWorks output, the global model is in static equilibrium with a residual reaction force of 4.05 × 10⁻⁴ N, which is numerically negligible.</w:t>
+        <w:t>In the full-frame configuration, the floor, side poles and roof act together as a closed structure. The static vertical dead weight applied at the battery-rack mounting interface is transferred from the floor into the side poles and, through them, into the roof structure. The horizontal static load (Force-4) applied at the battery-rack / side-pole interface is reacted simultaneously by the floor–side-pole connection at the bottom and by the roof–side-pole connection at the top, so that the upper part of the enclosure shares the load with the floor. As shown by the SolidWorks output, the global model is in static equilibrium with a residual reaction force of 4.05 × 10⁻⁴ N, which is numerically negligible.</w:t>
       </w:r>
     </w:p>
     <w:tbl>
@@ -2651,7 +2697,7 @@
     </w:p>
     <w:p>
       <w:r>
-        <w:t>Because the roof of the e-PU10 enclosure contributes to the global stiffness of the assembly, the full-frame configuration is mechanically more favourable than the floor-only configuration: the vertical reaction at the battery-rack mounting interface is shared between the floor and the side-pole / roof structure, which reduces the bending moment in the floor beams. The dominant elevated-stress regions of the full-frame configuration are therefore expected to be:</w:t>
+        <w:t>Because the roof of the e-PU10 enclosure contributes to the global stiffness of the assembly, the full-frame configuration is mechanically more favourable than the floor-only configuration: the vertical reaction at the battery-rack mounting interface and the horizontal design load (Force-4) are both shared between the floor and the side-pole / roof structure, which reduces the bending moment in the floor beams. The dominant elevated-stress regions of the full-frame configuration are therefore expected to be:</w:t>
       </w:r>
     </w:p>
     <w:p>
@@ -2696,12 +2742,9 @@
     </w:p>
     <w:p>
       <w:r>
-        <w:t xml:space="preserve">In the floor-only study the roof and battery modules have been removed. The static dead weight of the battery rack and auxiliary equipment is applied directly at the battery-rack mounting interface on the floor beams and is reacted exclusively by the bonded floor-to-virtual-wall interaction. This configuration is </w:t>
+        <w:t>In the floor-only study the roof and battery modules have been removed. The vertical dead weight of the battery rack and auxiliary equipment, together with the 113 kN horizontal design load (Force-4), is applied directly at the battery-rack mounting interface on the floor beams and is reacted exclusively by the bonded floor-to-virtual-wall interaction. This configuration is intentionally conservative: the new floor must support the full static load case on its own, without any contribution from the roof or side-pole structure.</w:t>
       </w:r>
-      <w:r>
-        <w:lastRenderedPageBreak/>
-        <w:t>intentionally conservative: the new floor must support the full static load on its own, without any contribution from the roof or side-pole structure.</w:t>
-      </w:r>
+      <w:r/>
     </w:p>
     <w:tbl>
       <w:tblPr>
@@ -3245,7 +3288,7 @@
           </w:tcPr>
           <w:p>
             <w:r>
-              <w:t>Load path of static loads</w:t>
+              <w:t>Load path of applied static loads</w:t>
             </w:r>
           </w:p>
         </w:tc>
@@ -3254,11 +3297,8 @@
             <w:tcW w:w="3402" w:type="dxa"/>
           </w:tcPr>
           <w:p>
-            <w:pPr>
-              <w:cnfStyle w:val="000000100000" w:firstRow="0" w:lastRow="0" w:firstColumn="0" w:lastColumn="0" w:oddVBand="0" w:evenVBand="0" w:oddHBand="1" w:evenHBand="0" w:firstRowFirstColumn="0" w:firstRowLastColumn="0" w:lastRowFirstColumn="0" w:lastRowLastColumn="0"/>
-            </w:pPr>
-            <w:r>
-              <w:t>Floor, side poles and roof act as a closed structure; the static load from the battery rack is shared between the floor and the side-pole / roof assembly.</w:t>
+            <w:r>
+              <w:t>Floor, side poles and roof act as a closed structure; the vertical dead weight and the horizontal design load (Force-4) are shared between the floor and the side-pole / roof assembly.</w:t>
             </w:r>
           </w:p>
         </w:tc>
@@ -3267,11 +3307,8 @@
             <w:tcW w:w="3402" w:type="dxa"/>
           </w:tcPr>
           <w:p>
-            <w:pPr>
-              <w:cnfStyle w:val="000000100000" w:firstRow="0" w:lastRow="0" w:firstColumn="0" w:lastColumn="0" w:oddVBand="0" w:evenVBand="0" w:oddHBand="1" w:evenHBand="0" w:firstRowFirstColumn="0" w:firstRowLastColumn="0" w:lastRowFirstColumn="0" w:lastRowLastColumn="0"/>
-            </w:pPr>
-            <w:r>
-              <w:t>Floor reacts the full static load on its own, without any contribution from the roof; cantilever-like behaviour.</w:t>
+            <w:r>
+              <w:t>Floor reacts the full static load case (vertical dead weight + 113 kN horizontal design load) on its own, without any contribution from the roof; cantilever-like behaviour.</w:t>
             </w:r>
           </w:p>
         </w:tc>
@@ -3949,7 +3986,7 @@
         <w:pStyle w:val="Lijstopsomteken"/>
       </w:pPr>
       <w:r>
-        <w:t>The October 2025 revision of the e-PU10 battery-module floor satisfies the strength and stiffness acceptance criteria adopted for the structural verification of the new floor design under the static battery-rack dead weight (21.4 kN) and auxiliary equipment (0.5 kN) load case.</w:t>
+        <w:t>The October 2025 revision of the e-PU10 battery-module floor satisfies the strength and stiffness acceptance criteria adopted for the structural verification of the new floor design under the combined static load case applied in the FEM studies (21.4 kN battery-rack dead weight + 0.5 kN auxiliary + 113 kN horizontal design load at the battery-rack interface).</w:t>
       </w:r>
     </w:p>
     <w:p>
@@ -4025,7 +4062,7 @@
         <w:pStyle w:val="Lijstopsomteken"/>
       </w:pPr>
       <w:r>
-        <w:t>Perform an independent strength check of the M12 bolted connection between the battery rack and the floor beams (3 bolts per beam, asymmetric pattern) under the vertical static dead weight of the battery rack (Force-2).</w:t>
+        <w:t>Perform an independent strength check of the M12 bolted connection between the battery rack and the floor beams (3 bolts per beam, asymmetric pattern) considering both the vertical static dead weight of the battery rack (Force-2) and the horizontal design load (Force-4) applied at the battery-rack interface.</w:t>
       </w:r>
     </w:p>
     <w:p>

</xml_diff>

<commit_message>
Update FEM report to incorporate newly added e-PU10 reference test documents
</commit_message>
<xml_diff>
--- a/FEM_Report_Battery_Module_Floor.docx
+++ b/FEM_Report_Battery_Module_Floor.docx
@@ -292,6 +292,10 @@
       <w:r>
         <w:t>stop load cases for the battery module have already been assessed in P000010005 and are not revisited in this report. The geometry analysed is the October 2025 revision of the floor (L-section beams with forklift-pocket gusset plates).</w:t>
       </w:r>
+      <w:r>
+        <w:rPr/>
+        <w:t xml:space="preserve"> The historical mechanical-stress documentation set for the earlier-generation e-PU10 — enclosure assembly (P000009139), battery rack and rack-rail attachment (P000009492) and power module (P000009459) — has been consolidated alongside the housing/battery-rack reference report P000010005 and is used to cross-check the material grades, load magnitudes and connection assumptions adopted in the present FEM study.</w:t>
+      </w:r>
     </w:p>
     <w:p>
       <w:pPr>
@@ -310,6 +314,33 @@
       </w:pPr>
       <w:r>
         <w:t>P000010005 – Mechanical Stress Analysis, housing &amp; battery rack (style and methodology reference).</w:t>
+      </w:r>
+    </w:p>
+    <w:p>
+      <w:pPr>
+        <w:pStyle w:val="Lijstopsomteken"/>
+      </w:pPr>
+      <w:r>
+        <w:rPr/>
+        <w:t>P000009139 – Mechanical Stress Analysis, enclosure assembly (base floor-weldment, forklift-pocket and roof-weldment design reference).</w:t>
+      </w:r>
+    </w:p>
+    <w:p>
+      <w:pPr>
+        <w:pStyle w:val="Lijstopsomteken"/>
+      </w:pPr>
+      <w:r>
+        <w:rPr/>
+        <w:t>P000009492 – Mechanical Stress Analysis, battery rack (rail / blind-rivet attachment, M12 and M16 bolt sizing for hoisting).</w:t>
+      </w:r>
+    </w:p>
+    <w:p>
+      <w:pPr>
+        <w:pStyle w:val="Lijstopsomteken"/>
+      </w:pPr>
+      <w:r>
+        <w:rPr/>
+        <w:t>P000009459 – Mechanical Stress Analysis, power module (cited for completeness of the e-PU10 mechanical-stress documentation set; not load-bearing for the battery-module floor).</w:t>
       </w:r>
     </w:p>
     <w:p>
@@ -1177,6 +1208,10 @@
       <w:r>
         <w:t>All structural members are made of S355 grade hot-rolled steel except for the four carbon-steel floor beams (P000008405FLR and P000008411FLR). The material library values used in the simulations are reproduced below.</w:t>
       </w:r>
+      <w:r>
+        <w:rPr/>
+        <w:t xml:space="preserve"> The forklift-pocket sheet-metal parts inherit the Corten A specification of the base enclosure (yield strength equivalent to S355JR, per P000009139 §4); in the SolidWorks model they are assigned the S355 material card and the small difference in yield is conservatively absorbed by the safety factor.</w:t>
+      </w:r>
     </w:p>
     <w:tbl>
       <w:tblPr>
@@ -1783,6 +1818,10 @@
     <w:p>
       <w:r>
         <w:t>Force-2 represents the static dead weight of the fully loaded battery rack applied to the battery-rack mounting interface on top of the floor beams. Force-3 covers the auxiliary equipment carried by the floor; its small numerical value (0.5 kN) confirms that no other significant secondary mass is included. Force-4 is a 113 kN horizontal static load applied at the battery-rack interface in the longitudinal (X) direction; in the full-frame study it is distributed over four faces of the side-pole / floor connections, while in the floor-only study it is applied to three faces of the forklift-pocket / battery-rack interface. The horizontal load is treated here as a static design load used to size the new floor; the underlying transport and emergency-stop load-case derivation is documented in P000010005 and is not revisited in the present report.</w:t>
+      </w:r>
+      <w:r>
+        <w:rPr/>
+        <w:t xml:space="preserve"> The 113 kN magnitude of Force-4 is traceable to the impact-load table of P000010005 (impact velocity 10 m/min with safety factor 1.6 on velocity, battery mass 5,500 kg, equivalent stiffness 26.6 MN/m → maximum impact force ≈ 113 kN at the battery-rack interface). The same magnitude bounds the horizontal-inertia load case (7 m/s² emergency-brake deceleration on a fully-loaded rack), so applying it as a static design load in the present verification of the new floor design conservatively covers both the impact and emergency-stop load cases documented in P000010005.</w:t>
       </w:r>
     </w:p>
     <w:p>
@@ -3546,6 +3585,36 @@
     </w:p>
     <w:p>
       <w:pPr>
+        <w:pStyle w:val="Kop2"/>
+      </w:pPr>
+      <w:r>
+        <w:rPr/>
+        <w:t>9.1  Comparison with the Previous Test Campaign (P000010005, P000009139, P000009492)</w:t>
+      </w:r>
+    </w:p>
+    <w:p>
+      <w:pPr/>
+      <w:r>
+        <w:rPr/>
+        <w:t>The previous test campaign documented in P000010005 was driven by the transport / impact-load study (impact velocity 10 m/min with safety factor 1.6 on a 5,500 kg battery mass, yielding a maximum impact force of 113 kN and a maximum stress of 199 MPa on the strengthened design) and by the emergency-brake study (7 m/s² deceleration giving peak stresses of ~213 MPa in the positive-X direction and ~200 MPa in the negative-X direction; capped at 175 MPa after the 5-5-2025 « boomerangs » update with M12 SS304 cross-bracing rods). The October 2025 floor revision (L-section beams in place of U-section beams, raised forklift pockets and a 10 mm gusset plate at the forklift-pocket corner) is the geometry analysed in the present report and is consistent with the design update appended to P000010005. The bulk von Mises stress in the primary load-carrying members of the redesigned floor remains ≤ ~175 MPa, in line with the 175 MPa scale adopted in the boomerangs update; the previously identified high-stress locations (lower part of the vertical battery-rack supports, side-beam / floor-beam joints, upper enclosure corners) are reproduced in the present full-frame interpretation (§7), confirming continuity between the two campaigns. The maximum displacement values are not directly comparable — the 8.65 mm reported here is the static-load floor-only URES, whereas P000010005 reports 4.2 mm at the battery modules under the dynamic impact load with the roof and rack contributing in series — but both remain well within the L/200 acceptance limit for container floors.</w:t>
+      </w:r>
+    </w:p>
+    <w:p>
+      <w:pPr/>
+      <w:r>
+        <w:rPr/>
+        <w:t>The battery-rack and rack-rail attachment study P000009492 already verifies the connection between the battery modules and the rack rails (3.2 kN shear per blind rivet vs. 11 kN capacity of the Fabory 34350.064.020 rivet, max stress 156 MPa at the lifting square-tube interface), and verifies the M12 / M16 hoisting-bolt set at the top of the rack (clamping-force friction 24.8 kN &gt; 10 kN per pole — safety factor 2.48; bolt-shear capacity 58 kN — safety factor 5.8). These checks bound the bolted load-path *upstream* of the battery-rack mounting tabs and are complementary to — but do not replace — the independent verification of the floor-side 3 × M12 bolted connection requested in §13.</w:t>
+      </w:r>
+    </w:p>
+    <w:p>
+      <w:pPr/>
+      <w:r>
+        <w:rPr/>
+        <w:t>The base enclosure FEM P000009139 sizes the floor-weldment beams, the forklift-pocket assembly (4 mm S355JR top flange, 6 mm Corten A pockets, five support ribs) and the roof-weldment buckling envelope for a 12-tonne payload. The geometry analysed in P000014110FLR inherits the forklift-pocket / roof design from P000009139 and adds the October 2025 floor revision; the present FEM study does not re-verify the items already approved in P000009139 (lifting by the floor weldment, roof-weldment buckling, internal-beam ribbing) which remain covered by that reference report.</w:t>
+      </w:r>
+    </w:p>
+    <w:p>
+      <w:pPr>
         <w:pStyle w:val="Kop1"/>
       </w:pPr>
       <w:r>
@@ -3939,6 +4008,10 @@
       <w:r>
         <w:lastRenderedPageBreak/>
         <w:t>Battery-rack mounting tabs / floor-beam interface: location of the maximum displacement (8.65 mm). The bolted connection (3 × M12 per beam) carries the vertical dead weight of the battery rack into the new floor. An independent bolt-strength check shall be performed in addition to the FEM analysis.</w:t>
+      </w:r>
+      <w:r>
+        <w:rPr/>
+        <w:t xml:space="preserve"> The hoisting-side M12 / M16 bolt set at the top of the rack has been independently verified in P000009492 (friction-clamping SF 2.48; bolt-shear SF 5.8); the floor-side 3 × M12 connection is upstream of those checks and shall be verified separately against the combined Force-2 + Force-4 case.</w:t>
       </w:r>
     </w:p>
     <w:p>
@@ -4064,6 +4137,10 @@
       <w:r>
         <w:t>Perform an independent strength check of the M12 bolted connection between the battery rack and the floor beams (3 bolts per beam, asymmetric pattern) considering both the vertical static dead weight of the battery rack (Force-2) and the horizontal design load (Force-4) applied at the battery-rack interface.</w:t>
       </w:r>
+      <w:r>
+        <w:rPr/>
+        <w:t xml:space="preserve"> The corresponding rack-side bolt verification (hoisting load case, M12 / M16) is already documented in P000009492; the action item retained here covers the floor-side bolt set under the combined static load case adopted in the present report.</w:t>
+      </w:r>
     </w:p>
     <w:p>
       <w:pPr>
@@ -4895,6 +4972,15 @@
       </w:pPr>
       <w:r>
         <w:t>Static load case only – dynamic load cases (transport, emergency-stop, impact) are not addressed in this report and remain covered by reference report P000010005.</w:t>
+      </w:r>
+    </w:p>
+    <w:p>
+      <w:pPr>
+        <w:pStyle w:val="Lijstopsomteken"/>
+      </w:pPr>
+      <w:r>
+        <w:rPr/>
+        <w:t>Battery-rack rail-to-frame blind-rivet connections (covered in P000009492) and the six roof-side gusset plates that share part of the rack dead weight with the floor (per P000010005 §2) are not explicitly modelled in the floor-only study; conservatively neglecting these load paths concentrates the full vertical reaction on the floor beams.</w:t>
       </w:r>
     </w:p>
     <w:sectPr>

</xml_diff>

<commit_message>
Align FEM report with P000010005: Force-4 reclassified as 113 kN vertical impact load; condense and clean up
</commit_message>
<xml_diff>
--- a/FEM_Report_Battery_Module_Floor.docx
+++ b/FEM_Report_Battery_Module_Floor.docx
@@ -93,52 +93,27 @@
         <w:rPr>
           <w:b/>
         </w:rPr>
-        <w:t>Document reference: FEM-P000014110FLR</w:t>
+        <w:t>Document reference: FEM-P000014110FLR — based on SolidWorks Simulation studies « Static 1 » (full frame) and « Static 2 zonder batterijmodule en dak » (floor only).</w:t>
       </w:r>
       <w:r>
         <w:rPr>
           <w:b/>
         </w:rPr>
-        <w:br/>
       </w:r>
-      <w:r>
-        <w:t>Based on SolidWorks Simulation studies</w:t>
-      </w:r>
-      <w:r>
-        <w:br/>
-      </w:r>
-      <w:r>
-        <w:t>‘</w:t>
-      </w:r>
-      <w:r>
-        <w:t xml:space="preserve">Static </w:t>
-      </w:r>
+      <w:r/>
+      <w:r/>
+      <w:r/>
+      <w:r/>
       <w:proofErr w:type="gramStart"/>
-      <w:r>
-        <w:t>1  (</w:t>
-      </w:r>
+      <w:r/>
       <w:proofErr w:type="gramEnd"/>
-      <w:r>
-        <w:t>full frame)</w:t>
-      </w:r>
-      <w:r>
-        <w:t>’</w:t>
-      </w:r>
-      <w:r>
-        <w:t xml:space="preserve"> and </w:t>
-      </w:r>
-      <w:r>
-        <w:t>‘</w:t>
-      </w:r>
-      <w:r>
-        <w:t>Static 2 zonder batterijmodule en dak (floor only)</w:t>
-      </w:r>
-      <w:r>
-        <w:t>’</w:t>
-      </w:r>
-      <w:r>
-        <w:br/>
-      </w:r>
+      <w:r/>
+      <w:r/>
+      <w:r/>
+      <w:r/>
+      <w:r/>
+      <w:r/>
+      <w:r/>
     </w:p>
     <w:p>
       <w:r>
@@ -159,38 +134,25 @@
     </w:p>
     <w:p>
       <w:r>
-        <w:t>This report documents the mechanical stress analysis of the floor structure of the e-PU10 battery module (P000014110FLR) and its supporting frame. Two finite-element studies have been performed using SolidWorks Simulation Premium: a full-frame static study including the floor, side poles and roof structure, and a reduced floor-only study in which the roof and battery modules have been removed in order to isolate the structural response of the floor.</w:t>
+        <w:t>This report documents the structural verification of the redesigned floor of the e-PU10 battery module (P000014110FLR) and its supporting frame. Two SolidWorks Simulation Premium studies are reported: a full-frame study (Static 1) including the floor, side poles and roof, representing the in-service condition, and a floor-only study (Static 2) in which the roof and battery modules are removed to isolate the structural response of the floor. The objective is to confirm that the redesigned floor (October 2025 revision: L-section beams with forklift-pocket gusset plates) safely reacts the combined static and impact load case without yielding or excessive deflection.</w:t>
       </w:r>
     </w:p>
     <w:p>
       <w:r>
-        <w:t xml:space="preserve">The objective of the analyses is to verify whether the redesigned floor of the battery module can safely support the static weight of the battery rack and associated equipment without yielding, excessive deflection or structural failure. Because the floor has been substantially modified with respect to the previous generation of the battery module, a dedicated structural verification of the new floor design under static loading conditions was required. </w:t>
+        <w:t>The applied load case (per P000010005) is 21.4 kN battery-rack dead weight (Force-2) + 0.5 kN auxiliary equipment (Force-3) + 113 kN vertical impact load (Force-4, container-drop scenario with the SF 1.6 on velocity already included). Components are S355 hot-rolled steel (σy = 315 MPa) with four floor beams in generic carbon steel (σy ≈ 283 MPa). The floor-only model gives a maximum resultant displacement of 8.65 mm (≈ L/350) and a peak von Mises stress of 1,016 MPa concentrated at a single mesh node in a sharp re-entrant corner — a geometric singularity. With this singularity discounted, the bulk stress in the primary load-carrying members remains ≤ 175 MPa (SF ≈ 1.5 – 2 locally, &gt; 2 elsewhere) and the equivalent strain (0.13 %) stays below εy = 0.15 %, confirming linear-elastic behaviour.</w:t>
       </w:r>
       <w:proofErr w:type="gramStart"/>
-      <w:r>
-        <w:t>Particular attention</w:t>
-      </w:r>
+      <w:r/>
       <w:proofErr w:type="gramEnd"/>
-      <w:r>
-        <w:t xml:space="preserve"> is paid to the maximum von Mises stress with respect to </w:t>
-      </w:r>
+      <w:r/>
       <w:proofErr w:type="gramStart"/>
-      <w:r>
-        <w:t>the yield</w:t>
-      </w:r>
+      <w:r/>
       <w:proofErr w:type="gramEnd"/>
-      <w:r>
-        <w:t xml:space="preserve"> strength of the structural steel to the maximum global deflection to the location of the highest stresses and to the resulting safety factor. Emergency-stop, transport and horizontal-inertia load cases are outside the scope of the present report; those load cases were addressed and approved in the earlier design iteration documented in reference report P000010005 and are not reassessed here.</w:t>
-      </w:r>
+      <w:r/>
     </w:p>
     <w:p>
       <w:r>
-        <w:t>The floor is fabricated from S355 grade structural steel (yield strength σy = 315 MPa, tensile strength σu = 490 MPa) with a small number of components in a generic carbon steel (σy ≈ 283 MPa). Under the combined static load case considered in the FEM studies (21.4 kN battery-rack dead weight + 0.5 kN auxiliary equipment + 113 kN horizontal design load at the battery-rack interface), the floor-only model exhibits a maximum global resultant displacement of 8.65 mm and a peak von Mises stress of 1.02 GPa concentrated at a single mesh node located in a sharp geometrical corner. After exclusion of this localized numerical singularity, the bulk stress field in the primary load-carrying members remains below the material yield strength, and the structural behaviour of the redesigned floor is judged acceptable from a strength and stiffness point of view. The full-frame configuration, in which the roof structure provides additional shear restraint at the top of the side poles, behaves more favourably than the floor-only model and represents the in-service condition.</w:t>
-      </w:r>
-    </w:p>
-    <w:p>
-      <w:r>
-        <w:t>Local design improvements at the identified stress concentrations (forklift-pocket corners and the connection between the floor beams and the battery-rack mounting tabs) are recommended in order to remove the localized peaks and to bring the redesigned floor to a uniform safety factor of at least 2 against yielding under the static load case.</w:t>
+        <w:t>The redesigned floor satisfies the strength and stiffness acceptance criteria; the local safety factor at the forklift-pocket corners — already mitigated by the 10 mm gusset plate added in the October 2025 revision — is the only marginal item. Adding a fillet (R ≥ 5 mm) at the re-entrant corner and an independent strength check of the floor-side 3 × M12 bolted connection are recommended to bring every region above SF 2.</w:t>
       </w:r>
     </w:p>
     <w:p>
@@ -206,7 +168,7 @@
     </w:p>
     <w:p>
       <w:r>
-        <w:t>The purpose of this document is to provide an engineering interpretation of the FEM results obtained for the redesigned battery-module floor and to determine whether the new floor design satisfies the strength and stiffness requirements of the e-PU10 platform under static loading conditions. The floor has been substantially modified compared to the previous generation of the battery module, and the present study is dedicated to the structural verification of those design changes. Emergency-stop, transport and other horizontal-inertia load cases are explicitly out of scope: they were addressed in the previous design iteration and remain covered by the approved reference report P000010005. Two complementary static configurations have been investigated:</w:t>
+        <w:t>This document interprets the FEM results obtained for the redesigned battery-module floor and verifies that the new floor design meets the strength and stiffness requirements of the e-PU10 platform under the combined static and impact load case derived from P000010005. Two complementary configurations are investigated:</w:t>
       </w:r>
     </w:p>
     <w:p>
@@ -214,84 +176,43 @@
         <w:pStyle w:val="Lijstopsomteken"/>
       </w:pPr>
       <w:r>
-        <w:lastRenderedPageBreak/>
-        <w:t xml:space="preserve">Full frame study (Static 1): the complete battery module floor, side poles and roof is loaded with the static dead weight of the battery rack and the associated ancillary equipment. This configuration represents the </w:t>
+        <w:t>Full-frame study (Static 1): floor, side poles and roof loaded with the combined static and impact loads at the battery-rack and auxiliary-equipment interfaces — represents the in-service condition.</w:t>
       </w:r>
       <w:proofErr w:type="gramStart"/>
-      <w:r>
-        <w:t>in</w:t>
-      </w:r>
-      <w:r>
-        <w:t xml:space="preserve"> </w:t>
-      </w:r>
-      <w:r>
-        <w:t>service</w:t>
-      </w:r>
+      <w:r/>
+      <w:r/>
+      <w:r/>
       <w:proofErr w:type="gramEnd"/>
-      <w:r>
-        <w:t xml:space="preserve"> load transfer from the battery rack into the floor through the supporting frame.</w:t>
-      </w:r>
+      <w:r/>
     </w:p>
     <w:p>
       <w:pPr>
         <w:pStyle w:val="Lijstopsomteken"/>
       </w:pPr>
       <w:r>
-        <w:t>Floor only study (Static 2 zonder batterijmodule en dak): the same static external loads are applied directly to the floor, with the roof and battery modules removed from the model. This conservative configuration eliminates any load redistribution between the roof and the floor and isolates the new floor design as the sole primary load</w:t>
+        <w:t>Floor-only study (Static 2 — zonder batterijmodule en dak): the same loads applied directly to the floor with the roof and battery modules removed — eliminates load redistribution into the upper structure and isolates the floor as the sole primary load-carrying element.</w:t>
       </w:r>
-      <w:r>
-        <w:t xml:space="preserve"> </w:t>
-      </w:r>
-      <w:r>
-        <w:t>carrying element.</w:t>
-      </w:r>
+      <w:r/>
+      <w:r/>
     </w:p>
     <w:p>
       <w:r>
-        <w:t>The analysis is limited to a linear</w:t>
+        <w:t>The analysis is a linear-elastic, small-displacement static study of the October 2025 floor revision. Fatigue, emergency-brake / horizontal-inertia load cases and detailed weld-throat strength are out of scope and remain covered by P000010005. Material grades, load magnitudes and connection assumptions are cross-checked against the supporting reference set: P000010005 (housing &amp; rack), P000009139 (enclosure assembly), P000009492 (battery-rack rail / rivet &amp; bolt sizing) and P000009459 (power module — non-load-bearing for the floor).</w:t>
       </w:r>
-      <w:r>
-        <w:t xml:space="preserve"> </w:t>
-      </w:r>
-      <w:r>
-        <w:t>elastic, small</w:t>
-      </w:r>
-      <w:r>
-        <w:t xml:space="preserve"> </w:t>
-      </w:r>
-      <w:r>
-        <w:t>displacement static study of the new floor design. Dynamic load cases, fatigue, transport and emergency-brake loading, as well as detailed welded</w:t>
-      </w:r>
-      <w:r>
-        <w:t xml:space="preserve"> </w:t>
-      </w:r>
-      <w:r>
-        <w:t>joint strength</w:t>
-      </w:r>
-      <w:r>
-        <w:t xml:space="preserve"> </w:t>
-      </w:r>
-      <w:r>
-        <w:t>are out of scope</w:t>
-      </w:r>
-      <w:r>
-        <w:t>.</w:t>
-      </w:r>
-      <w:r>
-        <w:t xml:space="preserve"> </w:t>
-      </w:r>
-      <w:r>
-        <w:t>T</w:t>
-      </w:r>
-      <w:r>
-        <w:t>he relevant transportation and emergency</w:t>
-      </w:r>
-      <w:r>
-        <w:t xml:space="preserve"> </w:t>
-      </w:r>
-      <w:r>
-        <w:t>stop load cases for the battery module have already been assessed in P000010005 and are not revisited in this report. The geometry analysed is the October 2025 revision of the floor (L-section beams with forklift-pocket gusset plates). The historical mechanical-stress documentation set for the earlier-generation e-PU10 — enclosure assembly (P000009139), battery rack and rack-rail attachment (P000009492) and power module (P000009459) — has been consolidated alongside the housing/battery-rack reference report P000010005 and is used to cross-check the material grades, load magnitudes and connection assumptions adopted in the present FEM study.</w:t>
-      </w:r>
+      <w:r/>
+      <w:r/>
+      <w:r/>
+      <w:r/>
+      <w:r/>
+      <w:r/>
+      <w:r/>
+      <w:r/>
+      <w:r/>
+      <w:r/>
+      <w:r/>
+      <w:r/>
+      <w:r/>
+      <w:r/>
     </w:p>
     <w:p>
       <w:pPr>
@@ -373,7 +294,7 @@
     </w:p>
     <w:p>
       <w:r>
-        <w:t>All studies have been performed in SolidWorks Simulation Premium using the FFEPlus iterative solver, mixed solid mesh, curvature-based mesher, high quality mesh (16 Jacobian points), small-displacement linear-elastic formulation.</w:t>
+        <w:t>All studies use SolidWorks Simulation Premium with the FFEPlus iterative solver, mixed solid mesh, curvature-based mesher (high-quality, 16 Jacobian points) and a small-displacement linear-elastic formulation.</w:t>
       </w:r>
     </w:p>
     <w:p>
@@ -389,12 +310,9 @@
     </w:p>
     <w:p>
       <w:r>
-        <w:t xml:space="preserve">The model under investigation is the assembly P000014110FLR which represents the battery module of the e-PU10 container. The floor is a welded steel structure built up from longitudinal and transverse beams. Two outer side beams form the forklift pockets; the battery rack is bolted onto these beams via three M12 bolts per side (asymmetric pattern: one bolt on one side, two on the other). The side poles connect the floor to the roof and provide the principal vertical and shear stiffness of the enclosure. Both analyses share the same </w:t>
+        <w:t>The model is the P000014110FLR assembly representing the e-PU10 battery-module enclosure. The floor is a welded steel structure made of longitudinal and transverse beams; the two outer side beams form the forklift pockets, and the battery rack is bolted to these beams via 3 × M12 bolts per side (asymmetric pattern: one bolt on one side, two on the other). The side poles tie the floor to the roof and provide the principal vertical and shear stiffness of the enclosure. Both studies share identical geometry, fixtures and load magnitudes; they differ only in the components included in the simulation.</w:t>
       </w:r>
-      <w:r>
-        <w:lastRenderedPageBreak/>
-        <w:t>geometry, fixtures and load magnitudes; they differ exclusively in the number of components included in the simulation.</w:t>
-      </w:r>
+      <w:r/>
     </w:p>
     <w:p>
       <w:pPr>
@@ -954,7 +872,7 @@
         <w:pStyle w:val="Lijstopsomteken"/>
       </w:pPr>
       <w:r>
-        <w:t>All welded and bolted joints are represented as bonded contacts. Bolt pre-load is not modelled explicitly the assumption is that the connection does not slip.</w:t>
+        <w:t>All welded and bolted joints are represented as bonded contacts; bolt pre-load is not modelled explicitly — the assumption is that the connection does not slip.</w:t>
       </w:r>
     </w:p>
     <w:p>
@@ -970,7 +888,7 @@
         <w:pStyle w:val="Lijstopsomteken"/>
       </w:pPr>
       <w:r>
-        <w:t>Only the load applied to the battery rack has been considered; secondary equipment (cooling, controls, cabling) has been omitted as in the reference document.</w:t>
+        <w:t>Only the loads applied at the battery-rack and auxiliary-equipment interfaces are considered; secondary equipment (cooling, controls, cabling) is omitted, consistent with the reference document.</w:t>
       </w:r>
     </w:p>
     <w:p>
@@ -978,7 +896,7 @@
         <w:pStyle w:val="Lijstopsomteken"/>
       </w:pPr>
       <w:r>
-        <w:t>Thermal effects are included with a zero-strain reference temperature of 298 K; the in-service thermal gradient is small and therefore not a driver in the current analyses.</w:t>
+        <w:t>Thermal effects use a zero-strain reference temperature of 298 K; the in-service thermal gradient is small and is not a driver in this analysis.</w:t>
       </w:r>
     </w:p>
     <w:p>
@@ -986,7 +904,7 @@
         <w:pStyle w:val="Lijstopsomteken"/>
       </w:pPr>
       <w:r>
-        <w:t>Geometry: model corresponds to the October 2025 floor revision (L-shape beams with forklift-pocket gusset plates).</w:t>
+        <w:t>Geometry: October 2025 floor revision (L-section beams with forklift-pocket gusset plates).</w:t>
       </w:r>
     </w:p>
     <w:p>
@@ -1193,7 +1111,7 @@
     </w:p>
     <w:p>
       <w:r>
-        <w:t>All structural members are made of S355 grade hot-rolled steel except for the four carbon-steel floor beams (P000008405FLR and P000008411FLR). The material library values used in the simulations are reproduced below. The forklift-pocket sheet-metal parts inherit the Corten A specification of the base enclosure (yield strength equivalent to S355JR, per P000009139 §4); in the SolidWorks model they are assigned the S355 material card and the small difference in yield is conservatively absorbed by the safety factor.</w:t>
+        <w:t>All structural members are S355 hot-rolled steel except the four carbon-steel floor beams (P000008405FLR and P000008411FLR). The forklift-pocket sheet metal is specified as Corten A in the base enclosure (yield equivalent to S355JR, per P000009139); in the SolidWorks model these parts use the S355 material card and the small yield difference is conservatively absorbed by the safety factor. Material library values are summarised below.</w:t>
       </w:r>
     </w:p>
     <w:tbl>
@@ -1565,7 +1483,7 @@
     </w:p>
     <w:p>
       <w:r>
-        <w:t>Three static loads have been defined in the SolidWorks Loads-and-Fixtures tree, representing the vertical dead weight of the battery rack and auxiliary equipment together with a horizontal design load applied at the battery-rack / forklift-pocket interface. Their magnitudes are taken from the SolidWorks studies P000014110FLR « Static 1 » (full frame) and « Static 2 » (floor only) and are applied as static loads in the present verification of the new floor design.</w:t>
+        <w:t>Three static loads are defined in the SolidWorks loads-and-fixtures tree. Their magnitudes and definitions are taken from P000010005 and applied identically in the « Static 1 » (full frame) and « Static 2 » (floor only) studies of P000014110FLR.</w:t>
       </w:r>
     </w:p>
     <w:tbl>
@@ -1646,7 +1564,7 @@
           </w:tcPr>
           <w:p>
             <w:r>
-              <w:t>Force-2 – Battery rack vertical reaction</w:t>
+              <w:t>Force-2 — Battery-rack dead weight</w:t>
             </w:r>
           </w:p>
         </w:tc>
@@ -1659,14 +1577,10 @@
               <w:cnfStyle w:val="000000100000" w:firstRow="0" w:lastRow="0" w:firstColumn="0" w:lastColumn="0" w:oddVBand="0" w:evenVBand="0" w:oddHBand="1" w:evenHBand="0" w:firstRowFirstColumn="0" w:firstRowLastColumn="0" w:lastRowFirstColumn="0" w:lastRowLastColumn="0"/>
             </w:pPr>
             <w:r>
-              <w:t>2,180 kg</w:t>
-            </w:r>
-            <w:r>
-              <w:t>, F</w:t>
-            </w:r>
-            <w:r>
-              <w:t xml:space="preserve"> ≈ 21,380 N</w:t>
-            </w:r>
+              <w:t>≈ 21.4 kN (2,180 kg × g)</w:t>
+            </w:r>
+            <w:r/>
+            <w:r/>
           </w:p>
         </w:tc>
         <w:tc>
@@ -1691,7 +1605,7 @@
               <w:cnfStyle w:val="000000100000" w:firstRow="0" w:lastRow="0" w:firstColumn="0" w:lastColumn="0" w:oddVBand="0" w:evenVBand="0" w:oddHBand="1" w:evenHBand="0" w:firstRowFirstColumn="0" w:firstRowLastColumn="0" w:lastRowFirstColumn="0" w:lastRowLastColumn="0"/>
             </w:pPr>
             <w:r>
-              <w:t>3 faces – battery rack mounting tabs on top of floor beams</w:t>
+              <w:t>3 faces — battery-rack mounting tabs on top of floor beams</w:t>
             </w:r>
           </w:p>
         </w:tc>
@@ -1707,7 +1621,7 @@
           </w:tcPr>
           <w:p>
             <w:r>
-              <w:t>Force-3 – Auxiliary equipment</w:t>
+              <w:t>Force-3 — Auxiliary equipment</w:t>
             </w:r>
           </w:p>
         </w:tc>
@@ -1720,7 +1634,7 @@
               <w:cnfStyle w:val="000000010000" w:firstRow="0" w:lastRow="0" w:firstColumn="0" w:lastColumn="0" w:oddVBand="0" w:evenVBand="0" w:oddHBand="0" w:evenHBand="1" w:firstRowFirstColumn="0" w:firstRowLastColumn="0" w:lastRowFirstColumn="0" w:lastRowLastColumn="0"/>
             </w:pPr>
             <w:r>
-              <w:t>500 N</w:t>
+              <w:t>0.5 kN</w:t>
             </w:r>
           </w:p>
         </w:tc>
@@ -1733,7 +1647,7 @@
               <w:cnfStyle w:val="000000010000" w:firstRow="0" w:lastRow="0" w:firstColumn="0" w:lastColumn="0" w:oddVBand="0" w:evenVBand="0" w:oddHBand="0" w:evenHBand="1" w:firstRowFirstColumn="0" w:firstRowLastColumn="0" w:lastRowFirstColumn="0" w:lastRowLastColumn="0"/>
             </w:pPr>
             <w:r>
-              <w:t>Vertical</w:t>
+              <w:t>Vertical (gravity)</w:t>
             </w:r>
           </w:p>
         </w:tc>
@@ -1746,7 +1660,7 @@
               <w:cnfStyle w:val="000000010000" w:firstRow="0" w:lastRow="0" w:firstColumn="0" w:lastColumn="0" w:oddVBand="0" w:evenVBand="0" w:oddHBand="0" w:evenHBand="1" w:firstRowFirstColumn="0" w:firstRowLastColumn="0" w:lastRowFirstColumn="0" w:lastRowLastColumn="0"/>
             </w:pPr>
             <w:r>
-              <w:t>2 faces – auxiliary mass distribution</w:t>
+              <w:t>2 faces — auxiliary mass distribution</w:t>
             </w:r>
           </w:p>
         </w:tc>
@@ -1762,7 +1676,7 @@
           </w:tcPr>
           <w:p>
             <w:r>
-              <w:t>Force-4 – Horizontal design load</w:t>
+              <w:t>Force-4 — Impact load (container drop)</w:t>
             </w:r>
           </w:p>
         </w:tc>
@@ -1775,7 +1689,7 @@
               <w:cnfStyle w:val="000000100000" w:firstRow="0" w:lastRow="0" w:firstColumn="0" w:lastColumn="0" w:oddVBand="0" w:evenVBand="0" w:oddHBand="1" w:evenHBand="0" w:firstRowFirstColumn="0" w:firstRowLastColumn="0" w:lastRowFirstColumn="0" w:lastRowLastColumn="0"/>
             </w:pPr>
             <w:r>
-              <w:t>113,000 N</w:t>
+              <w:t>113 kN (incl. SF 1.6 per P000010005)</w:t>
             </w:r>
           </w:p>
         </w:tc>
@@ -1788,7 +1702,7 @@
               <w:cnfStyle w:val="000000100000" w:firstRow="0" w:lastRow="0" w:firstColumn="0" w:lastColumn="0" w:oddVBand="0" w:evenVBand="0" w:oddHBand="1" w:evenHBand="0" w:firstRowFirstColumn="0" w:firstRowLastColumn="0" w:lastRowFirstColumn="0" w:lastRowLastColumn="0"/>
             </w:pPr>
             <w:r>
-              <w:t>Horizontal (longitudinal X)</w:t>
+              <w:t>Vertical (gravity)</w:t>
             </w:r>
           </w:p>
         </w:tc>
@@ -1801,7 +1715,7 @@
               <w:cnfStyle w:val="000000100000" w:firstRow="0" w:lastRow="0" w:firstColumn="0" w:lastColumn="0" w:oddVBand="0" w:evenVBand="0" w:oddHBand="1" w:evenHBand="0" w:firstRowFirstColumn="0" w:firstRowLastColumn="0" w:lastRowFirstColumn="0" w:lastRowLastColumn="0"/>
             </w:pPr>
             <w:r>
-              <w:t>Full frame: 4 faces of side-pole / floor connections. Floor only: 3 faces of the forklift-pocket / battery-rack interface.</w:t>
+              <w:t>Same 2 faces as Force-3 (auxiliary mass distribution)</w:t>
             </w:r>
           </w:p>
         </w:tc>
@@ -1809,7 +1723,7 @@
     </w:tbl>
     <w:p>
       <w:r>
-        <w:t>Force-2 represents the static dead weight of the fully loaded battery rack applied to the battery-rack mounting interface on top of the floor beams. Force-3 covers the auxiliary equipment carried by the floor; its small numerical value (0.5 kN) confirms that no other significant secondary mass is included. Force-4 is a 113 kN horizontal static load applied at the battery-rack interface in the longitudinal (X) direction; in the full-frame study it is distributed over four faces of the side-pole / floor connections, while in the floor-only study it is applied to three faces of the forklift-pocket / battery-rack interface. The horizontal load is treated here as a static design load used to size the new floor; the underlying transport and emergency-stop load-case derivation is documented in P000010005 and is not revisited in the present report. The 113 kN magnitude of Force-4 is traceable to the impact-load table of P000010005 (impact velocity 10 m/min with safety factor 1.6 on velocity, battery mass 5,500 kg, equivalent stiffness 26.6 MN/m → maximum impact force ≈ 113 kN at the battery-rack interface). The same magnitude bounds the horizontal-inertia load case (7 m/s² emergency-brake deceleration on a fully-loaded rack), so applying it as a static design load in the present verification of the new floor design conservatively covers both the impact and emergency-stop load cases documented in P000010005.</w:t>
+        <w:t>Force-2 — battery-rack dead weight (≈ 21.4 kN, gravity direction) applied to three faces of the battery-rack mounting tabs on top of the floor beams. Force-3 — auxiliary equipment dead weight (0.5 kN, gravity direction) distributed over two faces representing the auxiliary mass. Force-4 — vertical impact load of 113 kN representing the container drop / set-down scenario defined in P000010005 (impact velocity 10 m/min including the safety factor of 1.6 on velocity, battery mass 5,500 kg, equivalent rack-and-floor stiffness 26.6 MN/m). The 113 kN magnitude already includes the specified safety margin and is therefore applied directly as a static-equivalent load. Force-4 acts in the gravity direction and is applied to the same two faces as Force-3 (auxiliary mass distribution). The horizontal-inertia / emergency-brake load case for the rack is not addressed here and remains covered by P000010005.</w:t>
       </w:r>
     </w:p>
     <w:p>
@@ -2398,7 +2312,7 @@
     </w:tbl>
     <w:p>
       <w:r>
-        <w:t>Local mesh controls have been deliberately tightened on the floor-only study around the forklift-pocket corners (Control-7, element size 2 mm) in order to capture the geometric stress concentrations that drive the local design of the new floor. Equilibrium has been checked through the resultant-force tables: in both studies the global reaction force on the rigid wall and reference vertex sums to less than 1 N, which confirms that the applied static loads are correctly balanced.</w:t>
+        <w:t>Local mesh controls are tightened in the floor-only study around the forklift-pocket corners (Control-7, element size 2 mm) to capture the geometric stress concentrations driving the local floor design. Equilibrium is verified through the resultant-force tables: in both studies the global reaction force on the rigid wall and reference vertex sums to less than 1 N, confirming that the applied loads are correctly balanced.</w:t>
       </w:r>
     </w:p>
     <w:p>
@@ -2414,7 +2328,7 @@
     </w:p>
     <w:p>
       <w:r>
-        <w:t>In the full-frame configuration, the floor, side poles and roof act together as a closed structure. The static vertical dead weight applied at the battery-rack mounting interface is transferred from the floor into the side poles and, through them, into the roof structure. The horizontal static load (Force-4) applied at the battery-rack / side-pole interface is reacted simultaneously by the floor–side-pole connection at the bottom and by the roof–side-pole connection at the top, so that the upper part of the enclosure shares the load with the floor. As shown by the SolidWorks output, the global model is in static equilibrium with a residual reaction force of 4.05 × 10⁻⁴ N, which is numerically negligible.</w:t>
+        <w:t>In the full-frame configuration the floor, side poles and roof act as a closed structure. The combined static and impact vertical loads (Force-2, Force-3 and Force-4) are introduced at the battery-rack mounting tabs and at the auxiliary-equipment faces and are reacted by the floor beams; the side poles and roof contribute additional global stiffness that limits floor bending and the displacement of the side-pole tops. The model is in numerical equilibrium with a residual reaction force of 4.05 × 10⁻⁴ N.</w:t>
       </w:r>
     </w:p>
     <w:tbl>
@@ -2725,17 +2639,9 @@
     </w:tbl>
     <w:p>
       <w:r>
-        <w:t>Engineering interpretation:</w:t>
+        <w:t>Because the roof contributes additional global stiffness, the full-frame configuration is mechanically more favourable than the floor-only configuration: floor bending and side-pole-top displacement are both reduced. The dominant elevated-stress regions are expected to be:</w:t>
       </w:r>
-    </w:p>
-    <w:p>
-      <w:r>
-        <w:t xml:space="preserve">Because the roof of the e-PU10 enclosure contributes to the global stiffness of the assembly, the full-frame configuration is mechanically more favourable than the floor-only configuration: the vertical reaction at the </w:t>
-      </w:r>
-      <w:r>
-        <w:lastRenderedPageBreak/>
-        <w:t>battery-rack mounting interface and the horizontal design load (Force-4) are both shared between the floor and the side-pole / roof structure, which reduces the bending moment in the floor beams. The dominant elevated-stress regions of the full-frame configuration are therefore expected to be:</w:t>
-      </w:r>
+      <w:r/>
     </w:p>
     <w:p>
       <w:pPr>
@@ -2763,7 +2669,7 @@
     </w:p>
     <w:p>
       <w:r>
-        <w:t>These regions are consistent with the strengthening measures already incorporated in the October 2025 floor revision (boomerang gussets, increased forklift-pocket height and 10 mm gusset plate at the forklift-pocket corner). Provided that the floor-only results discussed in §8 are bounded by the yield strength of the structural steel, the full-frame configuration is conservatively covered.</w:t>
+        <w:t>These regions are consistent with the strengthening already incorporated in the October 2025 floor revision (boomerang gussets, raised forklift pockets, 10 mm gusset plate at the forklift-pocket corner). Provided the floor-only results in §8 stay below yield, the full-frame configuration is conservatively bounded.</w:t>
       </w:r>
     </w:p>
     <w:p>
@@ -2779,7 +2685,7 @@
     </w:p>
     <w:p>
       <w:r>
-        <w:t>In the floor-only study the roof and battery modules have been removed. The vertical dead weight of the battery rack and auxiliary equipment, together with the 113 kN horizontal design load (Force-4), is applied directly at the battery-rack mounting interface on the floor beams and is reacted exclusively by the bonded floor-to-virtual-wall interaction. This configuration is intentionally conservative: the new floor must support the full static load case on its own, without any contribution from the roof or side-pole structure.</w:t>
+        <w:t>In the floor-only study the roof and battery modules are removed. The full combined load case (Force-2 + Force-3 + Force-4 ≈ 135 kN, all acting in the gravity direction) is applied at the battery-rack mounting tabs and at the auxiliary-equipment faces and is reacted exclusively by the bonded floor-to-virtual-wall interaction. This configuration is intentionally conservative: the floor must support the full load case unaided by the roof or side-pole structure.</w:t>
       </w:r>
     </w:p>
     <w:tbl>
@@ -3201,12 +3107,12 @@
     </w:p>
     <w:p>
       <w:r>
-        <w:t>The reported peak von Mises stress of 1,016 MPa is more than three times the yield strength of the structural steel and would, if taken at face value, indicate gross yielding. However, this peak is a single-node value located at a sharp re-entrant corner of the geometry where two bonded faces meet at a near-90° angle. This is the classical signature of a geometrical singularity – a region in which the analytical solution of linear elasticity tends towards infinity and the FEM result diverges as the mesh is refined. In line with common FEM practice, such localized peaks are discounted in favour of an averaged stress in the surrounding material when assessing the integrity of the structure.</w:t>
+        <w:t>The peak von Mises stress of 1,016 MPa exceeds the yield strength by more than a factor of three. This peak is, however, a single-node value at a sharp re-entrant corner where two bonded faces meet at ≈ 90° — the classical signature of a geometrical singularity, in which the linear-elastic solution diverges as the mesh is refined. Such localised peaks are discounted in favour of an averaged stress in the surrounding material when assessing structural integrity.</w:t>
       </w:r>
     </w:p>
     <w:p>
       <w:r>
-        <w:t>Inspection of the stress plot (Figure 4) shows that the bulk of the floor structure operates in the 30 – 175 MPa range, with a few well-defined hot-spots in the corners of the forklift pockets and in the immediate vicinity of the battery-rack mounting tabs. The 175 MPa contour – which corresponds to the safety-factor-2 threshold established in the reference document – is confined to small zones at the forklift-pocket corners, exactly where the additional 10 mm gusset plate has already been added in the October 2025 revision.</w:t>
+        <w:t>The stress plot (Figure 4) shows the bulk of the floor in the 30 – 175 MPa range, with well-defined hot-spots at the forklift-pocket corners and around the battery-rack mounting tabs. The 175 MPa contour (the SF-2 threshold from the reference document) is confined to small zones at the forklift-pocket corners — exactly where the 10 mm gusset plate has already been added in the October 2025 revision.</w:t>
       </w:r>
     </w:p>
     <w:p>
@@ -3222,7 +3128,7 @@
     </w:p>
     <w:p>
       <w:r>
-        <w:t>The maximum global resultant displacement is 8.65 mm. Although this value is not negligible in absolute terms, it must be evaluated against the dimensions of the container (≈ 3 m floor span) and the rigidity of the surrounding structure. The deflection corresponds to a span-to-deflection ratio of approximately L/350, which is well within usual structural limits for static container floors (typical acceptance: L/200 to L/300). The displacement is dominated by the local deformation at the battery-rack interface, which is consistent with the expected behaviour of a floor that is missing its upper restraint. In the in-service condition (full-frame, §7), the presence of the roof reduces the displacement at the top of the side poles, so that the floor-only value of 8.65 mm represents a conservative upper bound for the static deflection of the redesigned floor.</w:t>
+        <w:t>The maximum resultant displacement is 8.65 mm. Against a floor span of ≈ 3 m this gives a span-to-deflection ratio of ≈ L/350, well within the L/200 – L/300 acceptance range usually applied to static container floors. The displacement is dominated by local deformation at the battery-rack interface, consistent with the absence of upper restraint in this configuration. In the in-service condition (full frame, §7) the roof restrains the side-pole tops, so the 8.65 mm value is a conservative upper bound.</w:t>
       </w:r>
     </w:p>
     <w:p>
@@ -3239,7 +3145,7 @@
     </w:p>
     <w:p>
       <w:r>
-        <w:t>The equivalent strain plot reaches a maximum of 1.29 × 10⁻³ (= 0.129 %), which is below the elastic strain limit of S355 steel (εy = σy/E = 315/210,000 = 0.150 %). Outside the geometrical singularity, the structure therefore remains in the elastic regime under the applied static load, in agreement with the linear-elastic assumption used by the solver. This consistency check provides additional confidence that the bulk of the new floor does not yield.</w:t>
+        <w:t>The equivalent-strain field peaks at 1.29 × 10⁻³ (= 0.129 %), below the elastic strain limit of S355 steel (εy = σy/E = 315/210,000 = 0.150 %). Outside the geometric singularity the structure remains elastic, in agreement with the linear-elastic assumption used by the solver.</w:t>
       </w:r>
     </w:p>
     <w:p>
@@ -3255,7 +3161,7 @@
     </w:p>
     <w:p>
       <w:r>
-        <w:t>The two studies have been deliberately set up to share the same static loads, materials and fixtures, so that the only variable is the presence (full-frame) or absence (floor-only) of the roof and side-pole structure. The comparison below highlights the influence of the surrounding structure on the static load distribution in the new floor design.</w:t>
+        <w:t>The two studies share identical loads, materials and fixtures; the only variable is the presence (full frame) or absence (floor only) of the roof and side-pole structure. The comparison below highlights the influence of the surrounding structure on the load distribution in the new floor design.</w:t>
       </w:r>
     </w:p>
     <w:tbl>
@@ -3335,7 +3241,7 @@
               <w:cnfStyle w:val="000000100000" w:firstRow="0" w:lastRow="0" w:firstColumn="0" w:lastColumn="0" w:oddVBand="0" w:evenVBand="0" w:oddHBand="1" w:evenHBand="0" w:firstRowFirstColumn="0" w:firstRowLastColumn="0" w:lastRowFirstColumn="0" w:lastRowLastColumn="0"/>
             </w:pPr>
             <w:r>
-              <w:t>Floor, side poles and roof act as a closed structure; the vertical dead weight and the horizontal design load (Force-4) are shared between the floor and the side-pole / roof assembly.</w:t>
+              <w:t>Floor, side poles and roof act as a closed structure; the combined vertical loads (Force-2 + Force-3 + Force-4) are reacted by the floor with additional global stiffness from the side-pole / roof assembly limiting floor bending and side-pole-top displacement.</w:t>
             </w:r>
           </w:p>
         </w:tc>
@@ -3348,7 +3254,7 @@
               <w:cnfStyle w:val="000000100000" w:firstRow="0" w:lastRow="0" w:firstColumn="0" w:lastColumn="0" w:oddVBand="0" w:evenVBand="0" w:oddHBand="1" w:evenHBand="0" w:firstRowFirstColumn="0" w:firstRowLastColumn="0" w:lastRowFirstColumn="0" w:lastRowLastColumn="0"/>
             </w:pPr>
             <w:r>
-              <w:t>Floor reacts the full static load case (vertical dead weight + 113 kN horizontal design load) on its own, without any contribution from the roof; cantilever-like behaviour.</w:t>
+              <w:t>Floor reacts the full ≈ 135 kN combined vertical load (Force-2 + Force-3 + Force-4) on its own, without contribution from the roof or side-pole structure.</w:t>
             </w:r>
           </w:p>
         </w:tc>
@@ -3566,7 +3472,7 @@
     </w:tbl>
     <w:p>
       <w:r>
-        <w:t>Because the floor-only model is the more demanding of the two, satisfying the acceptance criterion in this configuration also guarantees acceptance in the full-frame configuration. Subsequent design iterations should therefore continue to use the floor-only model for screening of the new floor design and reserve the full-frame model for verification of the final selected configuration.</w:t>
+        <w:t>The floor-only model is the more demanding of the two; satisfying the acceptance criteria there also guarantees acceptance in the full-frame configuration. Subsequent design iterations should use the floor-only model for screening and reserve the full-frame model for verification of the final selected configuration.</w:t>
       </w:r>
     </w:p>
     <w:p>
@@ -3579,21 +3485,18 @@
     </w:p>
     <w:p>
       <w:r>
-        <w:t xml:space="preserve">The previous test campaign documented in P000010005 was driven by the transport / impact-load study (impact velocity 10 m/min with safety factor 1.6 on a 5,500 kg battery mass, yielding a maximum impact force of 113 kN and a maximum stress of 199 MPa on the strengthened design) and by the emergency-brake study (7 m/s² deceleration giving peak stresses of ~213 MPa in the positive-X direction and ~200 MPa in the negative-X direction; capped at 175 MPa after the 5-5-2025 « boomerangs » update with M12 SS304 cross-bracing rods). The October 2025 floor revision (L-section beams in place of U-section beams, raised forklift </w:t>
+        <w:t>The previous test campaign in P000010005 was driven by the impact load case (10 m/min with SF 1.6, 5,500 kg battery mass, 26.6 MN/m → 113 kN, max stress 199 MPa on the strengthened design) and by the emergency-brake case (7 m/s² deceleration: ~213 MPa in +X, ~200 MPa in −X; capped at 175 MPa after the 5-5-2025 « boomerangs » update with M12 SS304 cross-bracing rods). The 113 kN impact magnitude is carried forward unchanged as Force-4 in the present study. The October 2025 floor revision (L-section beams replacing U-section, raised forklift pockets, 10 mm forklift-pocket corner gusset) is the geometry analysed here. The bulk von Mises stress in the redesigned floor stays ≤ ~175 MPa, in line with the 175 MPa scale of the boomerangs update; the previously identified high-stress regions (lower part of the vertical battery-rack supports, side-beam / floor-beam joints, upper enclosure corners) are reproduced in §7, confirming continuity between the two campaigns.</w:t>
       </w:r>
+      <w:r/>
+    </w:p>
+    <w:p>
       <w:r>
-        <w:lastRenderedPageBreak/>
-        <w:t>pockets and a 10 mm gusset plate at the forklift-pocket corner) is the geometry analysed in the present report and is consistent with the design update appended to P000010005. The bulk von Mises stress in the primary load-carrying members of the redesigned floor remains ≤ ~175 MPa, in line with the 175 MPa scale adopted in the boomerangs update; the previously identified high-stress locations (lower part of the vertical battery-rack supports, side-beam / floor-beam joints, upper enclosure corners) are reproduced in the present full-frame interpretation (§7), confirming continuity between the two campaigns. The maximum displacement values are not directly comparable — the 8.65 mm reported here is the static-load floor-only URES, whereas P000010005 reports 4.2 mm at the battery modules under the dynamic impact load with the roof and rack contributing in series — but both remain well within the L/200 acceptance limit for container floors.</w:t>
+        <w:t>P000009492 verifies the upstream load path: rivet shear (3.2 kN &lt; 11 kN capacity per Fabory 34350.064.020 rivet, 156 MPa max at the lifting square tube) and the rack-side hoisting bolts (M12 / M16 friction-clamping SF 2.48, bolt-shear SF 5.8). These checks are complementary to — but do not replace — the independent verification of the floor-side 3 × M12 connection requested in §13.</w:t>
       </w:r>
     </w:p>
     <w:p>
       <w:r>
-        <w:t>The battery-rack and rack-rail attachment study P000009492 already verifies the connection between the battery modules and the rack rails (3.2 kN shear per blind rivet vs. 11 kN capacity of the Fabory 34350.064.020 rivet, max stress 156 MPa at the lifting square-tube interface), and verifies the M12 / M16 hoisting-bolt set at the top of the rack (clamping-force friction 24.8 kN &gt; 10 kN per pole — safety factor 2.48; bolt-shear capacity 58 kN — safety factor 5.8). These checks bound the bolted load-path *upstream* of the battery-rack mounting tabs and are complementary to — but do not replace — the independent verification of the floor-side 3 × M12 bolted connection requested in §13.</w:t>
-      </w:r>
-    </w:p>
-    <w:p>
-      <w:r>
-        <w:t>The base enclosure FEM P000009139 sizes the floor-weldment beams, the forklift-pocket assembly (4 mm S355JR top flange, 6 mm Corten A pockets, five support ribs) and the roof-weldment buckling envelope for a 12-tonne payload. The geometry analysed in P000014110FLR inherits the forklift-pocket / roof design from P000009139 and adds the October 2025 floor revision; the present FEM study does not re-verify the items already approved in P000009139 (lifting by the floor weldment, roof-weldment buckling, internal-beam ribbing) which remain covered by that reference report.</w:t>
+        <w:t>P000009139 sizes the floor-weldment beams, the forklift-pocket assembly (4 mm S355JR top flange, 6 mm Corten A pockets, five support ribs) and the roof-weldment buckling envelope for a 12-tonne payload. P000014110FLR inherits the forklift-pocket and roof design from P000009139; items already approved there (lifting by the floor weldment, roof-weldment buckling, internal-beam ribbing) are not re-verified in the present study.</w:t>
       </w:r>
     </w:p>
     <w:p>
@@ -3609,7 +3512,7 @@
     </w:p>
     <w:p>
       <w:r>
-        <w:t>Combining the results of both studies, the structural performance of the battery module floor is assessed against the criteria defined in §4:</w:t>
+        <w:t>Combined with the results of both studies, the redesigned floor satisfies all strength and stiffness acceptance criteria. The only marginal item is the local safety factor at the forklift-pocket corners, where the bulk stress approaches but does not exceed yield; this is already mitigated by the 10 mm gusset added in the October 2025 revision. The numerical singularity at the sharp re-entrant corner is not a physical failure mode — it is a consequence of the linear-elastic FE formulation applied to a non-radiused corner and would disappear in a model with a finite fillet or with elasto-plastic material behaviour.</w:t>
       </w:r>
     </w:p>
     <w:tbl>
@@ -3955,15 +3858,6 @@
         </w:tc>
       </w:tr>
     </w:tbl>
-    <w:p>
-      <w:r>
-        <w:t xml:space="preserve">The redesigned floor satisfies all strength-of-material acceptance criteria with the exception of the local safety factor at the forklift-pocket corners, where the stress level approaches but does not exceed yield. This is a known feature of the geometry and has already been mitigated in the October 2025 revision through the </w:t>
-      </w:r>
-      <w:r>
-        <w:lastRenderedPageBreak/>
-        <w:t>addition of a 10 mm gusset plate. The numerical singularity at the sharp internal corner is not interpreted as a physical failure mode: it is a consequence of the linear-elastic FE formulation applied to a non-radiused geometric corner, and it would disappear in a model with a finite fillet or with elasto-plastic material behaviour.</w:t>
-      </w:r>
-    </w:p>
     <w:p>
       <w:pPr>
         <w:pStyle w:val="Kop1"/>
@@ -3985,7 +3879,7 @@
         <w:pStyle w:val="Lijstopsomteken"/>
       </w:pPr>
       <w:r>
-        <w:t>Forklift-pocket corners: re-entrant geometry produces a stress concentration. Already mitigated by a 10 mm gusset on the outside of the side beam; recommended to round the internal corner with a generous radius (R ≥ 5 mm) to remove the numerical singularity reported by the solver.</w:t>
+        <w:t>Forklift-pocket corners — re-entrant geometry produces a stress concentration. Already mitigated by a 10 mm gusset on the outside of the side beam; rounding the internal corner with a generous radius (R ≥ 5 mm) is recommended to remove the numerical singularity.</w:t>
       </w:r>
     </w:p>
     <w:p>
@@ -3993,7 +3887,7 @@
         <w:pStyle w:val="Lijstopsomteken"/>
       </w:pPr>
       <w:r>
-        <w:t>Battery-rack mounting tabs / floor-beam interface: location of the maximum displacement (8.65 mm). The bolted connection (3 × M12 per beam) carries the vertical dead weight of the battery rack into the new floor. An independent bolt-strength check shall be performed in addition to the FEM analysis. The hoisting-side M12 / M16 bolt set at the top of the rack has been independently verified in P000009492 (friction-clamping SF 2.48; bolt-shear SF 5.8); the floor-side 3 × M12 connection is upstream of those checks and shall be verified separately against the combined Force-2 + Force-4 case.</w:t>
+        <w:t>Battery-rack mounting tabs / floor-beam interface — location of the maximum displacement (8.65 mm). The 3 × M12 bolted connection carries the combined Force-2 + Force-4 vertical loads into the floor. The hoisting-side rack-bolt set (M12 / M16) has been verified independently in P000009492 (friction-clamping SF 2.48, bolt-shear SF 5.8); the floor-side 3 × M12 connection is upstream of those checks and shall be verified separately against the combined vertical load case.</w:t>
       </w:r>
     </w:p>
     <w:p>
@@ -4001,7 +3895,7 @@
         <w:pStyle w:val="Lijstopsomteken"/>
       </w:pPr>
       <w:r>
-        <w:t>Floor-beam to side-beam welds: in the full-frame configuration these welds transfer the static load between the floor and the side-pole structure. The weld throat and weld length in this region should be checked against the static load case.</w:t>
+        <w:t>Floor-beam to side-beam welds — in the full-frame configuration these welds transfer load between the floor and the side-pole structure. Weld throat and weld length should be checked against the combined load case.</w:t>
       </w:r>
     </w:p>
     <w:p>
@@ -4009,7 +3903,7 @@
         <w:pStyle w:val="Lijstopsomteken"/>
       </w:pPr>
       <w:r>
-        <w:t>Lower part of the vertical battery-rack supports: this region is loaded directly by the static dead weight of the battery rack and may experience locally elevated stresses, even though it is not part of the new floor structure as such.</w:t>
+        <w:t>Lower part of the vertical battery-rack supports — direct load-introduction region for the rack dead weight; not part of the new floor as such, but locally elevated stresses are expected.</w:t>
       </w:r>
     </w:p>
     <w:p>
@@ -4017,12 +3911,12 @@
         <w:pStyle w:val="Lijstopsomteken"/>
       </w:pPr>
       <w:r>
-        <w:t>Side-pole / floor connection: in the absence of the roof (floor-only model) this region is the principal load-introduction zone and exhibits secondary peaks in the stress field.</w:t>
+        <w:t>Side-pole / floor connection — in the floor-only model this is the principal load-introduction zone and shows secondary peaks in the stress field.</w:t>
       </w:r>
     </w:p>
     <w:p>
       <w:r>
-        <w:t>Risks associated with the above regions include local plastic deformation under sustained service loads, bolt-hole elongation at the battery-rack mounting tabs and local stress peaks at the welds. These risks are mitigated through the design improvements listed in §13.</w:t>
+        <w:t>Associated risks — local plastic deformation under sustained service loads, bolt-hole elongation at the battery-rack mounting tabs, and local stress peaks at the welds — are mitigated through the design improvements listed in §13.</w:t>
       </w:r>
     </w:p>
     <w:p>
@@ -4041,7 +3935,7 @@
         <w:pStyle w:val="Lijstopsomteken"/>
       </w:pPr>
       <w:r>
-        <w:t>The October 2025 revision of the e-PU10 battery-module floor satisfies the strength and stiffness acceptance criteria adopted for the structural verification of the new floor design under the combined static load case applied in the FEM studies (21.4 kN battery-rack dead weight + 0.5 kN auxiliary + 113 kN horizontal design load at the battery-rack interface).</w:t>
+        <w:t>The October 2025 revision of the e-PU10 battery-module floor satisfies the strength and stiffness acceptance criteria under the combined load case applied in the FEM studies (Force-2 ≈ 21.4 kN battery-rack dead weight + Force-3 = 0.5 kN auxiliary + Force-4 = 113 kN vertical impact load from the container-drop scenario of P000010005, including the SF 1.6 on velocity).</w:t>
       </w:r>
     </w:p>
     <w:p>
@@ -4049,7 +3943,7 @@
         <w:pStyle w:val="Lijstopsomteken"/>
       </w:pPr>
       <w:r>
-        <w:t>In the conservative floor-only configuration the maximum global resultant displacement is 8.65 mm, equivalent to a span-to-deflection ratio of L/350, which is well within the L/200 acceptance limit usually applied for static container floors.</w:t>
+        <w:t>In the conservative floor-only configuration the maximum resultant displacement is 8.65 mm (≈ L/350), well within the L/200 acceptance limit for static container floors.</w:t>
       </w:r>
     </w:p>
     <w:p>
@@ -4057,11 +3951,16 @@
         <w:pStyle w:val="Lijstopsomteken"/>
       </w:pPr>
       <w:r>
-        <w:t xml:space="preserve">Outside the localized geometrical singularity at the forklift-pocket corner, the von Mises stress in the primary load-carrying members of the new floor remains below the yield strength of S355 steel (315 </w:t>
+        <w:t>Outside the localised forklift-pocket-corner singularity, the von Mises stress in the primary load-carrying members stays below the S355 yield strength (315 MPa); the bulk safety factor is ≈ 1.5 – 2 locally and &gt; 2 elsewhere — marginal at the forklift-pocket corner only.</w:t>
       </w:r>
+      <w:r/>
+    </w:p>
+    <w:p>
+      <w:pPr>
+        <w:pStyle w:val="Lijstopsomteken"/>
+      </w:pPr>
       <w:r>
-        <w:lastRenderedPageBreak/>
-        <w:t>MPa). The bulk safety factor against yielding is of the order of 1.5 – 2, marginally below the target of 2 in the immediate vicinity of the forklift-pocket corner.</w:t>
+        <w:t>The equivalent-strain field is consistent with linear-elastic behaviour (εmax ≈ 0.13 % vs. εy = 0.15 %), validating the linear FE assumption.</w:t>
       </w:r>
     </w:p>
     <w:p>
@@ -4069,7 +3968,7 @@
         <w:pStyle w:val="Lijstopsomteken"/>
       </w:pPr>
       <w:r>
-        <w:t>The equivalent-strain field is consistent with linear-elastic behaviour (εmax ≈ 0.13 % vs. εy = 0.15 %), confirming the validity of the linear FE assumption.</w:t>
+        <w:t>The full-frame configuration is mechanically more favourable than the floor-only configuration and represents the in-service condition; acceptance in the floor-only model therefore guarantees acceptance in operation.</w:t>
       </w:r>
     </w:p>
     <w:p>
@@ -4077,15 +3976,7 @@
         <w:pStyle w:val="Lijstopsomteken"/>
       </w:pPr>
       <w:r>
-        <w:t>The full-frame configuration, in which the roof contributes additional shear restraint, is mechanically more favourable than the floor-only configuration and represents the in-service condition. Acceptance of the new floor design in the floor-only static model therefore guarantees acceptance in operation under the static load case.</w:t>
-      </w:r>
-    </w:p>
-    <w:p>
-      <w:pPr>
-        <w:pStyle w:val="Lijstopsomteken"/>
-      </w:pPr>
-      <w:r>
-        <w:t>Equilibrium of the model has been verified: the global reaction force is below 5 × 10⁻⁴ N, which is numerically zero with respect to the applied static loads.</w:t>
+        <w:t>Model equilibrium has been verified — the global reaction force is below 5 × 10⁻⁴ N, numerically zero with respect to the applied loads.</w:t>
       </w:r>
     </w:p>
     <w:p>
@@ -4104,7 +3995,7 @@
         <w:pStyle w:val="Lijstopsomteken"/>
       </w:pPr>
       <w:r>
-        <w:t>Add a fillet radius (R ≥ 5 mm) to the internal re-entrant corners of the forklift-pocket gusset in order to remove the geometrical singularity reported by the solver and to bring the local safety factor unambiguously above 2.</w:t>
+        <w:t>Add a fillet (R ≥ 5 mm) at the internal re-entrant corners of the forklift-pocket gusset to remove the geometrical singularity and bring the local safety factor unambiguously above 2.</w:t>
       </w:r>
     </w:p>
     <w:p>
@@ -4112,7 +4003,7 @@
         <w:pStyle w:val="Lijstopsomteken"/>
       </w:pPr>
       <w:r>
-        <w:t>Re-export the full-frame study (Static 1) with the « Plot » results stored, so that the von Mises stress, displacement and equivalent-strain plots are available for traceability. The Study-Results section of the SolidWorks-generated report is currently empty.</w:t>
+        <w:t>Re-export the full-frame study (Static 1) with the « Plot » results stored, so that the von Mises stress, displacement and equivalent-strain plots are available for traceability — the Study-Results section of the SolidWorks-generated report is currently empty.</w:t>
       </w:r>
     </w:p>
     <w:p>
@@ -4120,7 +4011,7 @@
         <w:pStyle w:val="Lijstopsomteken"/>
       </w:pPr>
       <w:r>
-        <w:t>Perform an independent strength check of the M12 bolted connection between the battery rack and the floor beams (3 bolts per beam, asymmetric pattern) considering both the vertical static dead weight of the battery rack (Force-2) and the horizontal design load (Force-4) applied at the battery-rack interface. The corresponding rack-side bolt verification (hoisting load case, M12 / M16) is already documented in P000009492; the action item retained here covers the floor-side bolt set under the combined static load case adopted in the present report.</w:t>
+        <w:t>Perform an independent strength check of the floor-side 3 × M12 bolted connection (asymmetric pattern) under the combined Force-2 + Force-4 vertical load case. The rack-side hoisting-bolt set is already covered in P000009492.</w:t>
       </w:r>
     </w:p>
     <w:p>
@@ -4128,7 +4019,7 @@
         <w:pStyle w:val="Lijstopsomteken"/>
       </w:pPr>
       <w:r>
-        <w:t>If required by the design-review process, complement the present static verification of the new floor design with the relevant joint-strength checks; transport, emergency-stop and dynamic load cases for the battery module remain covered by the approved reference report P000010005 and are not part of the present scope.</w:t>
+        <w:t>If required by the design-review process, complement the present static verification with the relevant joint-strength checks; emergency-brake and fatigue load cases remain covered by P000010005.</w:t>
       </w:r>
     </w:p>
     <w:p>
@@ -4136,7 +4027,7 @@
         <w:pStyle w:val="Lijstopsomteken"/>
       </w:pPr>
       <w:r>
-        <w:t>When the design is frozen, perform a final full-frame static run with the roof included in order to confirm the in-service stress and deflection levels in the new floor design.</w:t>
+        <w:t>When the design is frozen, perform a final full-frame static run with the roof included to confirm the in-service stress and deflection levels.</w:t>
       </w:r>
     </w:p>
     <w:p>
@@ -4144,15 +4035,7 @@
         <w:pStyle w:val="Lijstopsomteken"/>
       </w:pPr>
       <w:r>
-        <w:t>Apply the same load case in the negative X direction in order to verify symmetry of the response, as recommended in §5.1 of the reference document.</w:t>
-      </w:r>
-    </w:p>
-    <w:p>
-      <w:pPr>
-        <w:pStyle w:val="Lijstopsomteken"/>
-      </w:pPr>
-      <w:r>
-        <w:t>Consider increasing the local mesh refinement (Control-7, currently 2 mm) in the stress-concentration region of the forklift pockets and re-running the study to assess mesh convergence of the bulk stress.</w:t>
+        <w:t>Consider further local mesh refinement at the forklift-pocket stress concentrations (currently Control-7, 2 mm) to assess mesh convergence of the bulk stress.</w:t>
       </w:r>
     </w:p>
     <w:p>
@@ -4952,7 +4835,7 @@
         <w:pStyle w:val="Lijstopsomteken"/>
       </w:pPr>
       <w:r>
-        <w:t>Static load case only – dynamic load cases (transport, emergency-stop, impact) are not addressed in this report and remain covered by reference report P000010005.</w:t>
+        <w:t>Combined static and impact load case modelled as static-equivalent. The container-drop impact is captured through Force-4 (113 kN with SF 1.6 already included); fatigue, emergency-brake / horizontal-inertia and other transient dynamic cases are not addressed and remain covered by P000010005.</w:t>
       </w:r>
     </w:p>
     <w:p>
@@ -4960,7 +4843,7 @@
         <w:pStyle w:val="Lijstopsomteken"/>
       </w:pPr>
       <w:r>
-        <w:t>Battery-rack rail-to-frame blind-rivet connections (covered in P000009492) and the six roof-side gusset plates that share part of the rack dead weight with the floor (per P000010005 §2) are not explicitly modelled in the floor-only study; conservatively neglecting these load paths concentrates the full vertical reaction on the floor beams.</w:t>
+        <w:t>Battery-rack rail-to-frame blind-rivet connections (covered in P000009492) and the six roof-side gusset plates that share part of the rack dead weight (per P000010005 §2) are not explicitly modelled; conservatively neglecting these load paths concentrates the full vertical reaction on the floor beams.</w:t>
       </w:r>
     </w:p>
     <w:sectPr>

</xml_diff>